<commit_message>
Update methodology for final submission
</commit_message>
<xml_diff>
--- a/04-Development-and-Quality-Assurance/Evaluation-Testing/Methodology - Fedora Server.docx
+++ b/04-Development-and-Quality-Assurance/Evaluation-Testing/Methodology - Fedora Server.docx
@@ -222,30 +222,122 @@
           <w:szCs w:val="20"/>
         </w:rPr>
       </w:pPr>
-      <w:r>
-        <w:rPr>
-          <w:rFonts w:ascii="Fira Code Retina" w:hAnsi="Fira Code Retina" w:cs="Fira Code Retina"/>
-          <w:sz w:val="20"/>
-          <w:szCs w:val="20"/>
-        </w:rPr>
-        <w:t>sudo bash -c "echo blacklist nouveau &gt; /etc/modprobe.d/blacklist-nvidia-nouveau.conf"</w:t>
-      </w:r>
-    </w:p>
-    <w:p>
-      <w:pPr>
-        <w:rPr>
-          <w:rFonts w:ascii="Fira Code Retina" w:hAnsi="Fira Code Retina" w:cs="Fira Code Retina"/>
-          <w:sz w:val="20"/>
-          <w:szCs w:val="20"/>
-        </w:rPr>
-      </w:pPr>
-      <w:r>
-        <w:rPr>
-          <w:rFonts w:ascii="Fira Code Retina" w:hAnsi="Fira Code Retina" w:cs="Fira Code Retina"/>
-          <w:sz w:val="20"/>
-          <w:szCs w:val="20"/>
-        </w:rPr>
-        <w:t>sudo bash -c "echo options nouveau modeset=0 &gt;&gt;</w:t>
+      <w:proofErr w:type="spellStart"/>
+      <w:r>
+        <w:rPr>
+          <w:rFonts w:ascii="Fira Code Retina" w:hAnsi="Fira Code Retina" w:cs="Fira Code Retina"/>
+          <w:sz w:val="20"/>
+          <w:szCs w:val="20"/>
+        </w:rPr>
+        <w:t>sudo</w:t>
+      </w:r>
+      <w:proofErr w:type="spellEnd"/>
+      <w:r>
+        <w:rPr>
+          <w:rFonts w:ascii="Fira Code Retina" w:hAnsi="Fira Code Retina" w:cs="Fira Code Retina"/>
+          <w:sz w:val="20"/>
+          <w:szCs w:val="20"/>
+        </w:rPr>
+        <w:t xml:space="preserve"> bash -c "echo blacklist nouveau &gt; /etc/</w:t>
+      </w:r>
+      <w:proofErr w:type="spellStart"/>
+      <w:r>
+        <w:rPr>
+          <w:rFonts w:ascii="Fira Code Retina" w:hAnsi="Fira Code Retina" w:cs="Fira Code Retina"/>
+          <w:sz w:val="20"/>
+          <w:szCs w:val="20"/>
+        </w:rPr>
+        <w:t>modprobe.d</w:t>
+      </w:r>
+      <w:proofErr w:type="spellEnd"/>
+      <w:r>
+        <w:rPr>
+          <w:rFonts w:ascii="Fira Code Retina" w:hAnsi="Fira Code Retina" w:cs="Fira Code Retina"/>
+          <w:sz w:val="20"/>
+          <w:szCs w:val="20"/>
+        </w:rPr>
+        <w:t>/blacklist-</w:t>
+      </w:r>
+      <w:proofErr w:type="spellStart"/>
+      <w:r>
+        <w:rPr>
+          <w:rFonts w:ascii="Fira Code Retina" w:hAnsi="Fira Code Retina" w:cs="Fira Code Retina"/>
+          <w:sz w:val="20"/>
+          <w:szCs w:val="20"/>
+        </w:rPr>
+        <w:t>nvidia</w:t>
+      </w:r>
+      <w:proofErr w:type="spellEnd"/>
+      <w:r>
+        <w:rPr>
+          <w:rFonts w:ascii="Fira Code Retina" w:hAnsi="Fira Code Retina" w:cs="Fira Code Retina"/>
+          <w:sz w:val="20"/>
+          <w:szCs w:val="20"/>
+        </w:rPr>
+        <w:t>-</w:t>
+      </w:r>
+      <w:proofErr w:type="spellStart"/>
+      <w:r>
+        <w:rPr>
+          <w:rFonts w:ascii="Fira Code Retina" w:hAnsi="Fira Code Retina" w:cs="Fira Code Retina"/>
+          <w:sz w:val="20"/>
+          <w:szCs w:val="20"/>
+        </w:rPr>
+        <w:t>nouveau.conf</w:t>
+      </w:r>
+      <w:proofErr w:type="spellEnd"/>
+      <w:r>
+        <w:rPr>
+          <w:rFonts w:ascii="Fira Code Retina" w:hAnsi="Fira Code Retina" w:cs="Fira Code Retina"/>
+          <w:sz w:val="20"/>
+          <w:szCs w:val="20"/>
+        </w:rPr>
+        <w:t>"</w:t>
+      </w:r>
+    </w:p>
+    <w:p>
+      <w:pPr>
+        <w:rPr>
+          <w:rFonts w:ascii="Fira Code Retina" w:hAnsi="Fira Code Retina" w:cs="Fira Code Retina"/>
+          <w:sz w:val="20"/>
+          <w:szCs w:val="20"/>
+        </w:rPr>
+      </w:pPr>
+      <w:proofErr w:type="spellStart"/>
+      <w:r>
+        <w:rPr>
+          <w:rFonts w:ascii="Fira Code Retina" w:hAnsi="Fira Code Retina" w:cs="Fira Code Retina"/>
+          <w:sz w:val="20"/>
+          <w:szCs w:val="20"/>
+        </w:rPr>
+        <w:t>sudo</w:t>
+      </w:r>
+      <w:proofErr w:type="spellEnd"/>
+      <w:r>
+        <w:rPr>
+          <w:rFonts w:ascii="Fira Code Retina" w:hAnsi="Fira Code Retina" w:cs="Fira Code Retina"/>
+          <w:sz w:val="20"/>
+          <w:szCs w:val="20"/>
+        </w:rPr>
+        <w:t xml:space="preserve"> bash -c "echo options nouveau </w:t>
+      </w:r>
+      <w:proofErr w:type="spellStart"/>
+      <w:r>
+        <w:rPr>
+          <w:rFonts w:ascii="Fira Code Retina" w:hAnsi="Fira Code Retina" w:cs="Fira Code Retina"/>
+          <w:sz w:val="20"/>
+          <w:szCs w:val="20"/>
+        </w:rPr>
+        <w:t>modeset</w:t>
+      </w:r>
+      <w:proofErr w:type="spellEnd"/>
+      <w:r>
+        <w:rPr>
+          <w:rFonts w:ascii="Fira Code Retina" w:hAnsi="Fira Code Retina" w:cs="Fira Code Retina"/>
+          <w:sz w:val="20"/>
+          <w:szCs w:val="20"/>
+        </w:rPr>
+        <w:t>=0 &gt;&gt;</w:t>
       </w:r>
       <w:r>
         <w:rPr>
@@ -261,7 +353,61 @@
           <w:sz w:val="20"/>
           <w:szCs w:val="20"/>
         </w:rPr>
-        <w:t>/etc/modprobe.d/blacklist-nvidia-nouveau.conf"</w:t>
+        <w:t>/etc/</w:t>
+      </w:r>
+      <w:proofErr w:type="spellStart"/>
+      <w:r>
+        <w:rPr>
+          <w:rFonts w:ascii="Fira Code Retina" w:hAnsi="Fira Code Retina" w:cs="Fira Code Retina"/>
+          <w:sz w:val="20"/>
+          <w:szCs w:val="20"/>
+        </w:rPr>
+        <w:t>modprobe.d</w:t>
+      </w:r>
+      <w:proofErr w:type="spellEnd"/>
+      <w:r>
+        <w:rPr>
+          <w:rFonts w:ascii="Fira Code Retina" w:hAnsi="Fira Code Retina" w:cs="Fira Code Retina"/>
+          <w:sz w:val="20"/>
+          <w:szCs w:val="20"/>
+        </w:rPr>
+        <w:t>/blacklist-</w:t>
+      </w:r>
+      <w:proofErr w:type="spellStart"/>
+      <w:r>
+        <w:rPr>
+          <w:rFonts w:ascii="Fira Code Retina" w:hAnsi="Fira Code Retina" w:cs="Fira Code Retina"/>
+          <w:sz w:val="20"/>
+          <w:szCs w:val="20"/>
+        </w:rPr>
+        <w:t>nvidia</w:t>
+      </w:r>
+      <w:proofErr w:type="spellEnd"/>
+      <w:r>
+        <w:rPr>
+          <w:rFonts w:ascii="Fira Code Retina" w:hAnsi="Fira Code Retina" w:cs="Fira Code Retina"/>
+          <w:sz w:val="20"/>
+          <w:szCs w:val="20"/>
+        </w:rPr>
+        <w:t>-</w:t>
+      </w:r>
+      <w:proofErr w:type="spellStart"/>
+      <w:r>
+        <w:rPr>
+          <w:rFonts w:ascii="Fira Code Retina" w:hAnsi="Fira Code Retina" w:cs="Fira Code Retina"/>
+          <w:sz w:val="20"/>
+          <w:szCs w:val="20"/>
+        </w:rPr>
+        <w:t>nouveau.conf</w:t>
+      </w:r>
+      <w:proofErr w:type="spellEnd"/>
+      <w:r>
+        <w:rPr>
+          <w:rFonts w:ascii="Fira Code Retina" w:hAnsi="Fira Code Retina" w:cs="Fira Code Retina"/>
+          <w:sz w:val="20"/>
+          <w:szCs w:val="20"/>
+        </w:rPr>
+        <w:t>"</w:t>
       </w:r>
     </w:p>
     <w:p>
@@ -280,13 +426,41 @@
           <w:szCs w:val="20"/>
         </w:rPr>
       </w:pPr>
-      <w:r>
-        <w:rPr>
-          <w:rFonts w:ascii="Fira Code Retina" w:hAnsi="Fira Code Retina" w:cs="Fira Code Retina"/>
-          <w:sz w:val="20"/>
-          <w:szCs w:val="20"/>
-        </w:rPr>
-        <w:t>sudo dnf remove xorg-x11-drv-nouveau</w:t>
+      <w:proofErr w:type="spellStart"/>
+      <w:r>
+        <w:rPr>
+          <w:rFonts w:ascii="Fira Code Retina" w:hAnsi="Fira Code Retina" w:cs="Fira Code Retina"/>
+          <w:sz w:val="20"/>
+          <w:szCs w:val="20"/>
+        </w:rPr>
+        <w:t>sudo</w:t>
+      </w:r>
+      <w:proofErr w:type="spellEnd"/>
+      <w:r>
+        <w:rPr>
+          <w:rFonts w:ascii="Fira Code Retina" w:hAnsi="Fira Code Retina" w:cs="Fira Code Retina"/>
+          <w:sz w:val="20"/>
+          <w:szCs w:val="20"/>
+        </w:rPr>
+        <w:t xml:space="preserve"> </w:t>
+      </w:r>
+      <w:proofErr w:type="spellStart"/>
+      <w:r>
+        <w:rPr>
+          <w:rFonts w:ascii="Fira Code Retina" w:hAnsi="Fira Code Retina" w:cs="Fira Code Retina"/>
+          <w:sz w:val="20"/>
+          <w:szCs w:val="20"/>
+        </w:rPr>
+        <w:t>dnf</w:t>
+      </w:r>
+      <w:proofErr w:type="spellEnd"/>
+      <w:r>
+        <w:rPr>
+          <w:rFonts w:ascii="Fira Code Retina" w:hAnsi="Fira Code Retina" w:cs="Fira Code Retina"/>
+          <w:sz w:val="20"/>
+          <w:szCs w:val="20"/>
+        </w:rPr>
+        <w:t xml:space="preserve"> remove xorg-x11-drv-nouveau</w:t>
       </w:r>
     </w:p>
     <w:p>
@@ -296,6 +470,7 @@
       <w:r>
         <w:t xml:space="preserve">Regenerate </w:t>
       </w:r>
+      <w:proofErr w:type="spellStart"/>
       <w:r>
         <w:rPr>
           <w:rFonts w:ascii="Fira Code Retina" w:hAnsi="Fira Code Retina" w:cs="Fira Code Retina"/>
@@ -304,6 +479,7 @@
         </w:rPr>
         <w:t>initramfs</w:t>
       </w:r>
+      <w:proofErr w:type="spellEnd"/>
       <w:r>
         <w:t>:</w:t>
       </w:r>
@@ -317,13 +493,41 @@
           <w:szCs w:val="20"/>
         </w:rPr>
       </w:pPr>
-      <w:r>
-        <w:rPr>
-          <w:rFonts w:ascii="Fira Code Retina" w:hAnsi="Fira Code Retina" w:cs="Fira Code Retina"/>
-          <w:sz w:val="20"/>
-          <w:szCs w:val="20"/>
-        </w:rPr>
-        <w:t>sudo dracut ---regenerate-all --force</w:t>
+      <w:proofErr w:type="spellStart"/>
+      <w:r>
+        <w:rPr>
+          <w:rFonts w:ascii="Fira Code Retina" w:hAnsi="Fira Code Retina" w:cs="Fira Code Retina"/>
+          <w:sz w:val="20"/>
+          <w:szCs w:val="20"/>
+        </w:rPr>
+        <w:t>sudo</w:t>
+      </w:r>
+      <w:proofErr w:type="spellEnd"/>
+      <w:r>
+        <w:rPr>
+          <w:rFonts w:ascii="Fira Code Retina" w:hAnsi="Fira Code Retina" w:cs="Fira Code Retina"/>
+          <w:sz w:val="20"/>
+          <w:szCs w:val="20"/>
+        </w:rPr>
+        <w:t xml:space="preserve"> </w:t>
+      </w:r>
+      <w:proofErr w:type="spellStart"/>
+      <w:r>
+        <w:rPr>
+          <w:rFonts w:ascii="Fira Code Retina" w:hAnsi="Fira Code Retina" w:cs="Fira Code Retina"/>
+          <w:sz w:val="20"/>
+          <w:szCs w:val="20"/>
+        </w:rPr>
+        <w:t>dracut</w:t>
+      </w:r>
+      <w:proofErr w:type="spellEnd"/>
+      <w:r>
+        <w:rPr>
+          <w:rFonts w:ascii="Fira Code Retina" w:hAnsi="Fira Code Retina" w:cs="Fira Code Retina"/>
+          <w:sz w:val="20"/>
+          <w:szCs w:val="20"/>
+        </w:rPr>
+        <w:t xml:space="preserve"> ---regenerate-all --force</w:t>
       </w:r>
     </w:p>
     <w:p>
@@ -357,13 +561,23 @@
           <w:szCs w:val="20"/>
         </w:rPr>
       </w:pPr>
-      <w:r>
-        <w:rPr>
-          <w:rFonts w:ascii="Fira Code Retina" w:hAnsi="Fira Code Retina" w:cs="Fira Code Retina"/>
-          <w:sz w:val="20"/>
-          <w:szCs w:val="20"/>
-        </w:rPr>
-        <w:t xml:space="preserve">dnf download </w:t>
+      <w:proofErr w:type="spellStart"/>
+      <w:r>
+        <w:rPr>
+          <w:rFonts w:ascii="Fira Code Retina" w:hAnsi="Fira Code Retina" w:cs="Fira Code Retina"/>
+          <w:sz w:val="20"/>
+          <w:szCs w:val="20"/>
+        </w:rPr>
+        <w:t>dnf</w:t>
+      </w:r>
+      <w:proofErr w:type="spellEnd"/>
+      <w:r>
+        <w:rPr>
+          <w:rFonts w:ascii="Fira Code Retina" w:hAnsi="Fira Code Retina" w:cs="Fira Code Retina"/>
+          <w:sz w:val="20"/>
+          <w:szCs w:val="20"/>
+        </w:rPr>
+        <w:t xml:space="preserve"> download </w:t>
       </w:r>
       <w:r>
         <w:rPr>
@@ -395,24 +609,89 @@
           <w:sz w:val="20"/>
           <w:szCs w:val="20"/>
         </w:rPr>
-        <w:t xml:space="preserve"> netplan netplan-default-backend-networkd </w:t>
-      </w:r>
-      <w:r>
-        <w:rPr>
-          <w:rFonts w:ascii="Fira Code Retina" w:hAnsi="Fira Code Retina" w:cs="Fira Code Retina"/>
-          <w:sz w:val="20"/>
-          <w:szCs w:val="20"/>
-        </w:rPr>
-        <w:t>system-networkd</w:t>
-      </w:r>
-      <w:r>
-        <w:rPr>
-          <w:rFonts w:ascii="Fira Code Retina" w:hAnsi="Fira Code Retina" w:cs="Fira Code Retina"/>
-          <w:sz w:val="20"/>
-          <w:szCs w:val="20"/>
-        </w:rPr>
         <w:t xml:space="preserve"> </w:t>
       </w:r>
+      <w:proofErr w:type="spellStart"/>
+      <w:r>
+        <w:rPr>
+          <w:rFonts w:ascii="Fira Code Retina" w:hAnsi="Fira Code Retina" w:cs="Fira Code Retina"/>
+          <w:sz w:val="20"/>
+          <w:szCs w:val="20"/>
+        </w:rPr>
+        <w:t>netplan</w:t>
+      </w:r>
+      <w:proofErr w:type="spellEnd"/>
+      <w:r>
+        <w:rPr>
+          <w:rFonts w:ascii="Fira Code Retina" w:hAnsi="Fira Code Retina" w:cs="Fira Code Retina"/>
+          <w:sz w:val="20"/>
+          <w:szCs w:val="20"/>
+        </w:rPr>
+        <w:t xml:space="preserve"> </w:t>
+      </w:r>
+      <w:proofErr w:type="spellStart"/>
+      <w:r>
+        <w:rPr>
+          <w:rFonts w:ascii="Fira Code Retina" w:hAnsi="Fira Code Retina" w:cs="Fira Code Retina"/>
+          <w:sz w:val="20"/>
+          <w:szCs w:val="20"/>
+        </w:rPr>
+        <w:t>netplan</w:t>
+      </w:r>
+      <w:proofErr w:type="spellEnd"/>
+      <w:r>
+        <w:rPr>
+          <w:rFonts w:ascii="Fira Code Retina" w:hAnsi="Fira Code Retina" w:cs="Fira Code Retina"/>
+          <w:sz w:val="20"/>
+          <w:szCs w:val="20"/>
+        </w:rPr>
+        <w:t>-default-backend-</w:t>
+      </w:r>
+      <w:proofErr w:type="spellStart"/>
+      <w:r>
+        <w:rPr>
+          <w:rFonts w:ascii="Fira Code Retina" w:hAnsi="Fira Code Retina" w:cs="Fira Code Retina"/>
+          <w:sz w:val="20"/>
+          <w:szCs w:val="20"/>
+        </w:rPr>
+        <w:t>networkd</w:t>
+      </w:r>
+      <w:proofErr w:type="spellEnd"/>
+      <w:r>
+        <w:rPr>
+          <w:rFonts w:ascii="Fira Code Retina" w:hAnsi="Fira Code Retina" w:cs="Fira Code Retina"/>
+          <w:sz w:val="20"/>
+          <w:szCs w:val="20"/>
+        </w:rPr>
+        <w:t xml:space="preserve"> </w:t>
+      </w:r>
+      <w:r>
+        <w:rPr>
+          <w:rFonts w:ascii="Fira Code Retina" w:hAnsi="Fira Code Retina" w:cs="Fira Code Retina"/>
+          <w:sz w:val="20"/>
+          <w:szCs w:val="20"/>
+        </w:rPr>
+        <w:t>system-</w:t>
+      </w:r>
+      <w:proofErr w:type="spellStart"/>
+      <w:r>
+        <w:rPr>
+          <w:rFonts w:ascii="Fira Code Retina" w:hAnsi="Fira Code Retina" w:cs="Fira Code Retina"/>
+          <w:sz w:val="20"/>
+          <w:szCs w:val="20"/>
+        </w:rPr>
+        <w:t>networkd</w:t>
+      </w:r>
+      <w:proofErr w:type="spellEnd"/>
+      <w:r>
+        <w:rPr>
+          <w:rFonts w:ascii="Fira Code Retina" w:hAnsi="Fira Code Retina" w:cs="Fira Code Retina"/>
+          <w:sz w:val="20"/>
+          <w:szCs w:val="20"/>
+        </w:rPr>
+        <w:t xml:space="preserve"> </w:t>
+      </w:r>
+      <w:proofErr w:type="spellStart"/>
       <w:r>
         <w:rPr>
           <w:rFonts w:ascii="Fira Code Retina" w:hAnsi="Fira Code Retina" w:cs="Fira Code Retina"/>
@@ -421,6 +700,7 @@
         </w:rPr>
         <w:t>chrony</w:t>
       </w:r>
+      <w:proofErr w:type="spellEnd"/>
     </w:p>
     <w:p>
       <w:r>
@@ -468,6 +748,7 @@
           <w:szCs w:val="20"/>
         </w:rPr>
       </w:pPr>
+      <w:proofErr w:type="spellStart"/>
       <w:r>
         <w:rPr>
           <w:rFonts w:ascii="Fira Code Retina" w:hAnsi="Fira Code Retina" w:cs="Fira Code Retina"/>
@@ -484,6 +765,7 @@
         </w:rPr>
         <w:t>sblk</w:t>
       </w:r>
+      <w:proofErr w:type="spellEnd"/>
     </w:p>
     <w:p>
       <w:r>
@@ -515,14 +797,34 @@
           <w:szCs w:val="20"/>
         </w:rPr>
       </w:pPr>
-      <w:r>
-        <w:rPr>
-          <w:rFonts w:ascii="Fira Code Retina" w:hAnsi="Fira Code Retina" w:cs="Fira Code Retina"/>
-          <w:sz w:val="20"/>
-          <w:szCs w:val="20"/>
-        </w:rPr>
-        <w:t>sudo mount /dev/sda1 /mnt</w:t>
-      </w:r>
+      <w:proofErr w:type="spellStart"/>
+      <w:r>
+        <w:rPr>
+          <w:rFonts w:ascii="Fira Code Retina" w:hAnsi="Fira Code Retina" w:cs="Fira Code Retina"/>
+          <w:sz w:val="20"/>
+          <w:szCs w:val="20"/>
+        </w:rPr>
+        <w:t>sudo</w:t>
+      </w:r>
+      <w:proofErr w:type="spellEnd"/>
+      <w:r>
+        <w:rPr>
+          <w:rFonts w:ascii="Fira Code Retina" w:hAnsi="Fira Code Retina" w:cs="Fira Code Retina"/>
+          <w:sz w:val="20"/>
+          <w:szCs w:val="20"/>
+        </w:rPr>
+        <w:t xml:space="preserve"> mount /dev/sda1 /</w:t>
+      </w:r>
+      <w:proofErr w:type="spellStart"/>
+      <w:r>
+        <w:rPr>
+          <w:rFonts w:ascii="Fira Code Retina" w:hAnsi="Fira Code Retina" w:cs="Fira Code Retina"/>
+          <w:sz w:val="20"/>
+          <w:szCs w:val="20"/>
+        </w:rPr>
+        <w:t>mnt</w:t>
+      </w:r>
+      <w:proofErr w:type="spellEnd"/>
     </w:p>
     <w:p>
       <w:pPr>
@@ -535,6 +837,7 @@
       <w:r>
         <w:t xml:space="preserve"> </w:t>
       </w:r>
+      <w:proofErr w:type="spellStart"/>
       <w:r>
         <w:rPr>
           <w:rFonts w:ascii="Fira Code Retina" w:hAnsi="Fira Code Retina" w:cs="Fira Code Retina"/>
@@ -543,6 +846,7 @@
         </w:rPr>
         <w:t>netplan</w:t>
       </w:r>
+      <w:proofErr w:type="spellEnd"/>
       <w:r>
         <w:rPr>
           <w:rFonts w:cs="Fira Code Retina"/>
@@ -555,6 +859,7 @@
         </w:rPr>
         <w:t xml:space="preserve"> </w:t>
       </w:r>
+      <w:proofErr w:type="spellStart"/>
       <w:r>
         <w:rPr>
           <w:rFonts w:ascii="Fira Code Retina" w:hAnsi="Fira Code Retina" w:cs="Fira Code Retina"/>
@@ -579,6 +884,7 @@
         </w:rPr>
         <w:t>-networkd</w:t>
       </w:r>
+      <w:proofErr w:type="spellEnd"/>
       <w:r>
         <w:rPr>
           <w:rFonts w:cs="Fira Code Retina"/>
@@ -605,6 +911,7 @@
       <w:r>
         <w:t xml:space="preserve"> </w:t>
       </w:r>
+      <w:proofErr w:type="spellStart"/>
       <w:r>
         <w:rPr>
           <w:rFonts w:ascii="Fira Code Retina" w:hAnsi="Fira Code Retina" w:cs="Fira Code Retina"/>
@@ -613,6 +920,7 @@
         </w:rPr>
         <w:t>chrony</w:t>
       </w:r>
+      <w:proofErr w:type="spellEnd"/>
       <w:r>
         <w:t>:</w:t>
       </w:r>
@@ -625,13 +933,23 @@
           <w:szCs w:val="20"/>
         </w:rPr>
       </w:pPr>
-      <w:r>
-        <w:rPr>
-          <w:rFonts w:ascii="Fira Code Retina" w:hAnsi="Fira Code Retina" w:cs="Fira Code Retina"/>
-          <w:sz w:val="20"/>
-          <w:szCs w:val="20"/>
-        </w:rPr>
-        <w:t xml:space="preserve">sudo </w:t>
+      <w:proofErr w:type="spellStart"/>
+      <w:r>
+        <w:rPr>
+          <w:rFonts w:ascii="Fira Code Retina" w:hAnsi="Fira Code Retina" w:cs="Fira Code Retina"/>
+          <w:sz w:val="20"/>
+          <w:szCs w:val="20"/>
+        </w:rPr>
+        <w:t>sudo</w:t>
+      </w:r>
+      <w:proofErr w:type="spellEnd"/>
+      <w:r>
+        <w:rPr>
+          <w:rFonts w:ascii="Fira Code Retina" w:hAnsi="Fira Code Retina" w:cs="Fira Code Retina"/>
+          <w:sz w:val="20"/>
+          <w:szCs w:val="20"/>
+        </w:rPr>
+        <w:t xml:space="preserve"> </w:t>
       </w:r>
       <w:r>
         <w:rPr>
@@ -655,7 +973,43 @@
           <w:sz w:val="20"/>
           <w:szCs w:val="20"/>
         </w:rPr>
-        <w:t>-i /mnt/packages/*.</w:t>
+        <w:t>-</w:t>
+      </w:r>
+      <w:proofErr w:type="spellStart"/>
+      <w:r>
+        <w:rPr>
+          <w:rFonts w:ascii="Fira Code Retina" w:hAnsi="Fira Code Retina" w:cs="Fira Code Retina"/>
+          <w:sz w:val="20"/>
+          <w:szCs w:val="20"/>
+        </w:rPr>
+        <w:t>i</w:t>
+      </w:r>
+      <w:proofErr w:type="spellEnd"/>
+      <w:r>
+        <w:rPr>
+          <w:rFonts w:ascii="Fira Code Retina" w:hAnsi="Fira Code Retina" w:cs="Fira Code Retina"/>
+          <w:sz w:val="20"/>
+          <w:szCs w:val="20"/>
+        </w:rPr>
+        <w:t xml:space="preserve"> /</w:t>
+      </w:r>
+      <w:proofErr w:type="spellStart"/>
+      <w:r>
+        <w:rPr>
+          <w:rFonts w:ascii="Fira Code Retina" w:hAnsi="Fira Code Retina" w:cs="Fira Code Retina"/>
+          <w:sz w:val="20"/>
+          <w:szCs w:val="20"/>
+        </w:rPr>
+        <w:t>mnt</w:t>
+      </w:r>
+      <w:proofErr w:type="spellEnd"/>
+      <w:r>
+        <w:rPr>
+          <w:rFonts w:ascii="Fira Code Retina" w:hAnsi="Fira Code Retina" w:cs="Fira Code Retina"/>
+          <w:sz w:val="20"/>
+          <w:szCs w:val="20"/>
+        </w:rPr>
+        <w:t>/packages/*.</w:t>
       </w:r>
       <w:r>
         <w:rPr>
@@ -682,6 +1036,7 @@
       <w:r>
         <w:t xml:space="preserve"> </w:t>
       </w:r>
+      <w:proofErr w:type="spellStart"/>
       <w:r>
         <w:rPr>
           <w:rFonts w:ascii="Fira Code Retina" w:hAnsi="Fira Code Retina" w:cs="Fira Code Retina"/>
@@ -698,6 +1053,7 @@
         </w:rPr>
         <w:t>d</w:t>
       </w:r>
+      <w:proofErr w:type="spellEnd"/>
       <w:r>
         <w:rPr>
           <w:rFonts w:ascii="Fira Code Retina" w:hAnsi="Fira Code Retina" w:cs="Fira Code Retina"/>
@@ -722,49 +1078,163 @@
           <w:szCs w:val="20"/>
         </w:rPr>
       </w:pPr>
-      <w:r>
-        <w:rPr>
-          <w:rFonts w:ascii="Fira Code Retina" w:hAnsi="Fira Code Retina" w:cs="Fira Code Retina"/>
-          <w:sz w:val="20"/>
-          <w:szCs w:val="20"/>
-        </w:rPr>
-        <w:t>sudo dnf install system-networkd</w:t>
-      </w:r>
-    </w:p>
-    <w:p>
-      <w:pPr>
-        <w:spacing w:after="0"/>
-        <w:rPr>
-          <w:rFonts w:ascii="Fira Code Retina" w:hAnsi="Fira Code Retina" w:cs="Fira Code Retina"/>
-          <w:sz w:val="20"/>
-          <w:szCs w:val="20"/>
-        </w:rPr>
-      </w:pPr>
-      <w:r>
-        <w:rPr>
-          <w:rFonts w:ascii="Fira Code Retina" w:hAnsi="Fira Code Retina" w:cs="Fira Code Retina"/>
-          <w:sz w:val="20"/>
-          <w:szCs w:val="20"/>
-        </w:rPr>
-        <w:t>sudo systemctl enable system-networkd</w:t>
-      </w:r>
-    </w:p>
-    <w:p>
-      <w:pPr>
-        <w:rPr>
-          <w:rFonts w:ascii="Fira Code Retina" w:hAnsi="Fira Code Retina" w:cs="Fira Code Retina"/>
-          <w:sz w:val="20"/>
-          <w:szCs w:val="20"/>
-        </w:rPr>
-      </w:pPr>
-      <w:r>
-        <w:rPr>
-          <w:rFonts w:ascii="Fira Code Retina" w:hAnsi="Fira Code Retina" w:cs="Fira Code Retina"/>
-          <w:sz w:val="20"/>
-          <w:szCs w:val="20"/>
-        </w:rPr>
-        <w:t>sudo systemctl start system-networkd</w:t>
-      </w:r>
+      <w:proofErr w:type="spellStart"/>
+      <w:r>
+        <w:rPr>
+          <w:rFonts w:ascii="Fira Code Retina" w:hAnsi="Fira Code Retina" w:cs="Fira Code Retina"/>
+          <w:sz w:val="20"/>
+          <w:szCs w:val="20"/>
+        </w:rPr>
+        <w:t>sudo</w:t>
+      </w:r>
+      <w:proofErr w:type="spellEnd"/>
+      <w:r>
+        <w:rPr>
+          <w:rFonts w:ascii="Fira Code Retina" w:hAnsi="Fira Code Retina" w:cs="Fira Code Retina"/>
+          <w:sz w:val="20"/>
+          <w:szCs w:val="20"/>
+        </w:rPr>
+        <w:t xml:space="preserve"> </w:t>
+      </w:r>
+      <w:proofErr w:type="spellStart"/>
+      <w:r>
+        <w:rPr>
+          <w:rFonts w:ascii="Fira Code Retina" w:hAnsi="Fira Code Retina" w:cs="Fira Code Retina"/>
+          <w:sz w:val="20"/>
+          <w:szCs w:val="20"/>
+        </w:rPr>
+        <w:t>dnf</w:t>
+      </w:r>
+      <w:proofErr w:type="spellEnd"/>
+      <w:r>
+        <w:rPr>
+          <w:rFonts w:ascii="Fira Code Retina" w:hAnsi="Fira Code Retina" w:cs="Fira Code Retina"/>
+          <w:sz w:val="20"/>
+          <w:szCs w:val="20"/>
+        </w:rPr>
+        <w:t xml:space="preserve"> install system-</w:t>
+      </w:r>
+      <w:proofErr w:type="spellStart"/>
+      <w:r>
+        <w:rPr>
+          <w:rFonts w:ascii="Fira Code Retina" w:hAnsi="Fira Code Retina" w:cs="Fira Code Retina"/>
+          <w:sz w:val="20"/>
+          <w:szCs w:val="20"/>
+        </w:rPr>
+        <w:t>networkd</w:t>
+      </w:r>
+      <w:proofErr w:type="spellEnd"/>
+    </w:p>
+    <w:p>
+      <w:pPr>
+        <w:spacing w:after="0"/>
+        <w:rPr>
+          <w:rFonts w:ascii="Fira Code Retina" w:hAnsi="Fira Code Retina" w:cs="Fira Code Retina"/>
+          <w:sz w:val="20"/>
+          <w:szCs w:val="20"/>
+        </w:rPr>
+      </w:pPr>
+      <w:proofErr w:type="spellStart"/>
+      <w:r>
+        <w:rPr>
+          <w:rFonts w:ascii="Fira Code Retina" w:hAnsi="Fira Code Retina" w:cs="Fira Code Retina"/>
+          <w:sz w:val="20"/>
+          <w:szCs w:val="20"/>
+        </w:rPr>
+        <w:t>sudo</w:t>
+      </w:r>
+      <w:proofErr w:type="spellEnd"/>
+      <w:r>
+        <w:rPr>
+          <w:rFonts w:ascii="Fira Code Retina" w:hAnsi="Fira Code Retina" w:cs="Fira Code Retina"/>
+          <w:sz w:val="20"/>
+          <w:szCs w:val="20"/>
+        </w:rPr>
+        <w:t xml:space="preserve"> </w:t>
+      </w:r>
+      <w:proofErr w:type="spellStart"/>
+      <w:r>
+        <w:rPr>
+          <w:rFonts w:ascii="Fira Code Retina" w:hAnsi="Fira Code Retina" w:cs="Fira Code Retina"/>
+          <w:sz w:val="20"/>
+          <w:szCs w:val="20"/>
+        </w:rPr>
+        <w:t>systemctl</w:t>
+      </w:r>
+      <w:proofErr w:type="spellEnd"/>
+      <w:r>
+        <w:rPr>
+          <w:rFonts w:ascii="Fira Code Retina" w:hAnsi="Fira Code Retina" w:cs="Fira Code Retina"/>
+          <w:sz w:val="20"/>
+          <w:szCs w:val="20"/>
+        </w:rPr>
+        <w:t xml:space="preserve"> enable system-</w:t>
+      </w:r>
+      <w:proofErr w:type="spellStart"/>
+      <w:r>
+        <w:rPr>
+          <w:rFonts w:ascii="Fira Code Retina" w:hAnsi="Fira Code Retina" w:cs="Fira Code Retina"/>
+          <w:sz w:val="20"/>
+          <w:szCs w:val="20"/>
+        </w:rPr>
+        <w:t>networkd</w:t>
+      </w:r>
+      <w:proofErr w:type="spellEnd"/>
+    </w:p>
+    <w:p>
+      <w:pPr>
+        <w:rPr>
+          <w:rFonts w:ascii="Fira Code Retina" w:hAnsi="Fira Code Retina" w:cs="Fira Code Retina"/>
+          <w:sz w:val="20"/>
+          <w:szCs w:val="20"/>
+        </w:rPr>
+      </w:pPr>
+      <w:proofErr w:type="spellStart"/>
+      <w:r>
+        <w:rPr>
+          <w:rFonts w:ascii="Fira Code Retina" w:hAnsi="Fira Code Retina" w:cs="Fira Code Retina"/>
+          <w:sz w:val="20"/>
+          <w:szCs w:val="20"/>
+        </w:rPr>
+        <w:t>sudo</w:t>
+      </w:r>
+      <w:proofErr w:type="spellEnd"/>
+      <w:r>
+        <w:rPr>
+          <w:rFonts w:ascii="Fira Code Retina" w:hAnsi="Fira Code Retina" w:cs="Fira Code Retina"/>
+          <w:sz w:val="20"/>
+          <w:szCs w:val="20"/>
+        </w:rPr>
+        <w:t xml:space="preserve"> </w:t>
+      </w:r>
+      <w:proofErr w:type="spellStart"/>
+      <w:r>
+        <w:rPr>
+          <w:rFonts w:ascii="Fira Code Retina" w:hAnsi="Fira Code Retina" w:cs="Fira Code Retina"/>
+          <w:sz w:val="20"/>
+          <w:szCs w:val="20"/>
+        </w:rPr>
+        <w:t>systemctl</w:t>
+      </w:r>
+      <w:proofErr w:type="spellEnd"/>
+      <w:r>
+        <w:rPr>
+          <w:rFonts w:ascii="Fira Code Retina" w:hAnsi="Fira Code Retina" w:cs="Fira Code Retina"/>
+          <w:sz w:val="20"/>
+          <w:szCs w:val="20"/>
+        </w:rPr>
+        <w:t xml:space="preserve"> start system-</w:t>
+      </w:r>
+      <w:proofErr w:type="spellStart"/>
+      <w:r>
+        <w:rPr>
+          <w:rFonts w:ascii="Fira Code Retina" w:hAnsi="Fira Code Retina" w:cs="Fira Code Retina"/>
+          <w:sz w:val="20"/>
+          <w:szCs w:val="20"/>
+        </w:rPr>
+        <w:t>networkd</w:t>
+      </w:r>
+      <w:proofErr w:type="spellEnd"/>
     </w:p>
     <w:p>
       <w:pPr>
@@ -773,6 +1243,7 @@
       <w:r>
         <w:t xml:space="preserve">Then install </w:t>
       </w:r>
+      <w:proofErr w:type="spellStart"/>
       <w:r>
         <w:rPr>
           <w:rFonts w:ascii="Fira Code Retina" w:hAnsi="Fira Code Retina" w:cs="Fira Code Retina"/>
@@ -781,17 +1252,38 @@
         </w:rPr>
         <w:t>netplan</w:t>
       </w:r>
+      <w:proofErr w:type="spellEnd"/>
       <w:r>
         <w:t xml:space="preserve"> and </w:t>
       </w:r>
-      <w:r>
-        <w:rPr>
-          <w:rFonts w:ascii="Fira Code Retina" w:hAnsi="Fira Code Retina" w:cs="Fira Code Retina"/>
-          <w:sz w:val="20"/>
-          <w:szCs w:val="20"/>
-        </w:rPr>
-        <w:t>netplan-default-backend-networkd</w:t>
-      </w:r>
+      <w:proofErr w:type="spellStart"/>
+      <w:r>
+        <w:rPr>
+          <w:rFonts w:ascii="Fira Code Retina" w:hAnsi="Fira Code Retina" w:cs="Fira Code Retina"/>
+          <w:sz w:val="20"/>
+          <w:szCs w:val="20"/>
+        </w:rPr>
+        <w:t>netplan</w:t>
+      </w:r>
+      <w:proofErr w:type="spellEnd"/>
+      <w:r>
+        <w:rPr>
+          <w:rFonts w:ascii="Fira Code Retina" w:hAnsi="Fira Code Retina" w:cs="Fira Code Retina"/>
+          <w:sz w:val="20"/>
+          <w:szCs w:val="20"/>
+        </w:rPr>
+        <w:t>-default-backend-</w:t>
+      </w:r>
+      <w:proofErr w:type="spellStart"/>
+      <w:r>
+        <w:rPr>
+          <w:rFonts w:ascii="Fira Code Retina" w:hAnsi="Fira Code Retina" w:cs="Fira Code Retina"/>
+          <w:sz w:val="20"/>
+          <w:szCs w:val="20"/>
+        </w:rPr>
+        <w:t>networkd</w:t>
+      </w:r>
+      <w:proofErr w:type="spellEnd"/>
       <w:r>
         <w:t xml:space="preserve"> </w:t>
       </w:r>
@@ -806,6 +1298,7 @@
         </w:rPr>
         <w:t>--</w:t>
       </w:r>
+      <w:proofErr w:type="spellStart"/>
       <w:r>
         <w:rPr>
           <w:rFonts w:ascii="Fira Code Retina" w:hAnsi="Fira Code Retina" w:cs="Fira Code Retina"/>
@@ -814,6 +1307,7 @@
         </w:rPr>
         <w:t>allowerasing</w:t>
       </w:r>
+      <w:proofErr w:type="spellEnd"/>
       <w:r>
         <w:t xml:space="preserve"> </w:t>
       </w:r>
@@ -832,14 +1326,106 @@
           <w:szCs w:val="20"/>
         </w:rPr>
       </w:pPr>
-      <w:r>
-        <w:rPr>
-          <w:rFonts w:ascii="Fira Code Retina" w:hAnsi="Fira Code Retina" w:cs="Fira Code Retina"/>
-          <w:sz w:val="20"/>
-          <w:szCs w:val="20"/>
-        </w:rPr>
-        <w:t>sudo dnf install netplan netplan-default-backend-networkd --allowerasing</w:t>
-      </w:r>
+      <w:proofErr w:type="spellStart"/>
+      <w:r>
+        <w:rPr>
+          <w:rFonts w:ascii="Fira Code Retina" w:hAnsi="Fira Code Retina" w:cs="Fira Code Retina"/>
+          <w:sz w:val="20"/>
+          <w:szCs w:val="20"/>
+        </w:rPr>
+        <w:t>sudo</w:t>
+      </w:r>
+      <w:proofErr w:type="spellEnd"/>
+      <w:r>
+        <w:rPr>
+          <w:rFonts w:ascii="Fira Code Retina" w:hAnsi="Fira Code Retina" w:cs="Fira Code Retina"/>
+          <w:sz w:val="20"/>
+          <w:szCs w:val="20"/>
+        </w:rPr>
+        <w:t xml:space="preserve"> </w:t>
+      </w:r>
+      <w:proofErr w:type="spellStart"/>
+      <w:r>
+        <w:rPr>
+          <w:rFonts w:ascii="Fira Code Retina" w:hAnsi="Fira Code Retina" w:cs="Fira Code Retina"/>
+          <w:sz w:val="20"/>
+          <w:szCs w:val="20"/>
+        </w:rPr>
+        <w:t>dnf</w:t>
+      </w:r>
+      <w:proofErr w:type="spellEnd"/>
+      <w:r>
+        <w:rPr>
+          <w:rFonts w:ascii="Fira Code Retina" w:hAnsi="Fira Code Retina" w:cs="Fira Code Retina"/>
+          <w:sz w:val="20"/>
+          <w:szCs w:val="20"/>
+        </w:rPr>
+        <w:t xml:space="preserve"> install </w:t>
+      </w:r>
+      <w:proofErr w:type="spellStart"/>
+      <w:r>
+        <w:rPr>
+          <w:rFonts w:ascii="Fira Code Retina" w:hAnsi="Fira Code Retina" w:cs="Fira Code Retina"/>
+          <w:sz w:val="20"/>
+          <w:szCs w:val="20"/>
+        </w:rPr>
+        <w:t>netplan</w:t>
+      </w:r>
+      <w:proofErr w:type="spellEnd"/>
+      <w:r>
+        <w:rPr>
+          <w:rFonts w:ascii="Fira Code Retina" w:hAnsi="Fira Code Retina" w:cs="Fira Code Retina"/>
+          <w:sz w:val="20"/>
+          <w:szCs w:val="20"/>
+        </w:rPr>
+        <w:t xml:space="preserve"> </w:t>
+      </w:r>
+      <w:proofErr w:type="spellStart"/>
+      <w:r>
+        <w:rPr>
+          <w:rFonts w:ascii="Fira Code Retina" w:hAnsi="Fira Code Retina" w:cs="Fira Code Retina"/>
+          <w:sz w:val="20"/>
+          <w:szCs w:val="20"/>
+        </w:rPr>
+        <w:t>netplan</w:t>
+      </w:r>
+      <w:proofErr w:type="spellEnd"/>
+      <w:r>
+        <w:rPr>
+          <w:rFonts w:ascii="Fira Code Retina" w:hAnsi="Fira Code Retina" w:cs="Fira Code Retina"/>
+          <w:sz w:val="20"/>
+          <w:szCs w:val="20"/>
+        </w:rPr>
+        <w:t>-default-backend-</w:t>
+      </w:r>
+      <w:proofErr w:type="spellStart"/>
+      <w:r>
+        <w:rPr>
+          <w:rFonts w:ascii="Fira Code Retina" w:hAnsi="Fira Code Retina" w:cs="Fira Code Retina"/>
+          <w:sz w:val="20"/>
+          <w:szCs w:val="20"/>
+        </w:rPr>
+        <w:t>networkd</w:t>
+      </w:r>
+      <w:proofErr w:type="spellEnd"/>
+      <w:r>
+        <w:rPr>
+          <w:rFonts w:ascii="Fira Code Retina" w:hAnsi="Fira Code Retina" w:cs="Fira Code Retina"/>
+          <w:sz w:val="20"/>
+          <w:szCs w:val="20"/>
+        </w:rPr>
+        <w:t xml:space="preserve"> --</w:t>
+      </w:r>
+      <w:proofErr w:type="spellStart"/>
+      <w:r>
+        <w:rPr>
+          <w:rFonts w:ascii="Fira Code Retina" w:hAnsi="Fira Code Retina" w:cs="Fira Code Retina"/>
+          <w:sz w:val="20"/>
+          <w:szCs w:val="20"/>
+        </w:rPr>
+        <w:t>allowerasing</w:t>
+      </w:r>
+      <w:proofErr w:type="spellEnd"/>
     </w:p>
     <w:p>
       <w:pPr>
@@ -852,33 +1438,79 @@
         <w:t xml:space="preserve"> and mask</w:t>
       </w:r>
       <w:r>
-        <w:t xml:space="preserve"> NetworkManager:</w:t>
-      </w:r>
-    </w:p>
-    <w:p>
-      <w:pPr>
-        <w:rPr>
-          <w:rFonts w:ascii="Fira Code Retina" w:hAnsi="Fira Code Retina" w:cs="Fira Code Retina"/>
-          <w:sz w:val="20"/>
-          <w:szCs w:val="20"/>
-        </w:rPr>
-      </w:pPr>
-      <w:r>
-        <w:rPr>
-          <w:rFonts w:ascii="Fira Code Retina" w:hAnsi="Fira Code Retina" w:cs="Fira Code Retina"/>
-          <w:sz w:val="20"/>
-          <w:szCs w:val="20"/>
-        </w:rPr>
-        <w:t xml:space="preserve">sudo systemctl </w:t>
-      </w:r>
-      <w:r>
-        <w:rPr>
-          <w:rFonts w:ascii="Fira Code Retina" w:hAnsi="Fira Code Retina" w:cs="Fira Code Retina"/>
-          <w:sz w:val="20"/>
-          <w:szCs w:val="20"/>
-        </w:rPr>
-        <w:t>mask NetworkManager</w:t>
-      </w:r>
+        <w:t xml:space="preserve"> </w:t>
+      </w:r>
+      <w:proofErr w:type="spellStart"/>
+      <w:r>
+        <w:t>NetworkManager</w:t>
+      </w:r>
+      <w:proofErr w:type="spellEnd"/>
+      <w:r>
+        <w:t>:</w:t>
+      </w:r>
+    </w:p>
+    <w:p>
+      <w:pPr>
+        <w:rPr>
+          <w:rFonts w:ascii="Fira Code Retina" w:hAnsi="Fira Code Retina" w:cs="Fira Code Retina"/>
+          <w:sz w:val="20"/>
+          <w:szCs w:val="20"/>
+        </w:rPr>
+      </w:pPr>
+      <w:proofErr w:type="spellStart"/>
+      <w:r>
+        <w:rPr>
+          <w:rFonts w:ascii="Fira Code Retina" w:hAnsi="Fira Code Retina" w:cs="Fira Code Retina"/>
+          <w:sz w:val="20"/>
+          <w:szCs w:val="20"/>
+        </w:rPr>
+        <w:t>sudo</w:t>
+      </w:r>
+      <w:proofErr w:type="spellEnd"/>
+      <w:r>
+        <w:rPr>
+          <w:rFonts w:ascii="Fira Code Retina" w:hAnsi="Fira Code Retina" w:cs="Fira Code Retina"/>
+          <w:sz w:val="20"/>
+          <w:szCs w:val="20"/>
+        </w:rPr>
+        <w:t xml:space="preserve"> </w:t>
+      </w:r>
+      <w:proofErr w:type="spellStart"/>
+      <w:r>
+        <w:rPr>
+          <w:rFonts w:ascii="Fira Code Retina" w:hAnsi="Fira Code Retina" w:cs="Fira Code Retina"/>
+          <w:sz w:val="20"/>
+          <w:szCs w:val="20"/>
+        </w:rPr>
+        <w:t>systemctl</w:t>
+      </w:r>
+      <w:proofErr w:type="spellEnd"/>
+      <w:r>
+        <w:rPr>
+          <w:rFonts w:ascii="Fira Code Retina" w:hAnsi="Fira Code Retina" w:cs="Fira Code Retina"/>
+          <w:sz w:val="20"/>
+          <w:szCs w:val="20"/>
+        </w:rPr>
+        <w:t xml:space="preserve"> </w:t>
+      </w:r>
+      <w:r>
+        <w:rPr>
+          <w:rFonts w:ascii="Fira Code Retina" w:hAnsi="Fira Code Retina" w:cs="Fira Code Retina"/>
+          <w:sz w:val="20"/>
+          <w:szCs w:val="20"/>
+        </w:rPr>
+        <w:t xml:space="preserve">mask </w:t>
+      </w:r>
+      <w:proofErr w:type="spellStart"/>
+      <w:r>
+        <w:rPr>
+          <w:rFonts w:ascii="Fira Code Retina" w:hAnsi="Fira Code Retina" w:cs="Fira Code Retina"/>
+          <w:sz w:val="20"/>
+          <w:szCs w:val="20"/>
+        </w:rPr>
+        <w:t>NetworkManager</w:t>
+      </w:r>
+      <w:proofErr w:type="spellEnd"/>
     </w:p>
     <w:p>
       <w:pPr>
@@ -908,14 +1540,52 @@
           <w:szCs w:val="20"/>
         </w:rPr>
       </w:pPr>
-      <w:r>
-        <w:rPr>
-          <w:rFonts w:ascii="Fira Code Retina" w:hAnsi="Fira Code Retina" w:cs="Fira Code Retina"/>
-          <w:sz w:val="20"/>
-          <w:szCs w:val="20"/>
-        </w:rPr>
-        <w:t>sudo systemctl mask --now firewalld</w:t>
-      </w:r>
+      <w:proofErr w:type="spellStart"/>
+      <w:r>
+        <w:rPr>
+          <w:rFonts w:ascii="Fira Code Retina" w:hAnsi="Fira Code Retina" w:cs="Fira Code Retina"/>
+          <w:sz w:val="20"/>
+          <w:szCs w:val="20"/>
+        </w:rPr>
+        <w:t>sudo</w:t>
+      </w:r>
+      <w:proofErr w:type="spellEnd"/>
+      <w:r>
+        <w:rPr>
+          <w:rFonts w:ascii="Fira Code Retina" w:hAnsi="Fira Code Retina" w:cs="Fira Code Retina"/>
+          <w:sz w:val="20"/>
+          <w:szCs w:val="20"/>
+        </w:rPr>
+        <w:t xml:space="preserve"> </w:t>
+      </w:r>
+      <w:proofErr w:type="spellStart"/>
+      <w:r>
+        <w:rPr>
+          <w:rFonts w:ascii="Fira Code Retina" w:hAnsi="Fira Code Retina" w:cs="Fira Code Retina"/>
+          <w:sz w:val="20"/>
+          <w:szCs w:val="20"/>
+        </w:rPr>
+        <w:t>systemctl</w:t>
+      </w:r>
+      <w:proofErr w:type="spellEnd"/>
+      <w:r>
+        <w:rPr>
+          <w:rFonts w:ascii="Fira Code Retina" w:hAnsi="Fira Code Retina" w:cs="Fira Code Retina"/>
+          <w:sz w:val="20"/>
+          <w:szCs w:val="20"/>
+        </w:rPr>
+        <w:t xml:space="preserve"> mask --now </w:t>
+      </w:r>
+      <w:proofErr w:type="spellStart"/>
+      <w:r>
+        <w:rPr>
+          <w:rFonts w:ascii="Fira Code Retina" w:hAnsi="Fira Code Retina" w:cs="Fira Code Retina"/>
+          <w:sz w:val="20"/>
+          <w:szCs w:val="20"/>
+        </w:rPr>
+        <w:t>firewalld</w:t>
+      </w:r>
+      <w:proofErr w:type="spellEnd"/>
     </w:p>
     <w:p>
       <w:pPr>
@@ -951,14 +1621,52 @@
           <w:szCs w:val="20"/>
         </w:rPr>
       </w:pPr>
-      <w:r>
-        <w:rPr>
-          <w:rFonts w:ascii="Fira Code Retina" w:hAnsi="Fira Code Retina" w:cs="Fira Code Retina"/>
-          <w:sz w:val="20"/>
-          <w:szCs w:val="20"/>
-        </w:rPr>
-        <w:t>sudo systemctl status firewalld</w:t>
-      </w:r>
+      <w:proofErr w:type="spellStart"/>
+      <w:r>
+        <w:rPr>
+          <w:rFonts w:ascii="Fira Code Retina" w:hAnsi="Fira Code Retina" w:cs="Fira Code Retina"/>
+          <w:sz w:val="20"/>
+          <w:szCs w:val="20"/>
+        </w:rPr>
+        <w:t>sudo</w:t>
+      </w:r>
+      <w:proofErr w:type="spellEnd"/>
+      <w:r>
+        <w:rPr>
+          <w:rFonts w:ascii="Fira Code Retina" w:hAnsi="Fira Code Retina" w:cs="Fira Code Retina"/>
+          <w:sz w:val="20"/>
+          <w:szCs w:val="20"/>
+        </w:rPr>
+        <w:t xml:space="preserve"> </w:t>
+      </w:r>
+      <w:proofErr w:type="spellStart"/>
+      <w:r>
+        <w:rPr>
+          <w:rFonts w:ascii="Fira Code Retina" w:hAnsi="Fira Code Retina" w:cs="Fira Code Retina"/>
+          <w:sz w:val="20"/>
+          <w:szCs w:val="20"/>
+        </w:rPr>
+        <w:t>systemctl</w:t>
+      </w:r>
+      <w:proofErr w:type="spellEnd"/>
+      <w:r>
+        <w:rPr>
+          <w:rFonts w:ascii="Fira Code Retina" w:hAnsi="Fira Code Retina" w:cs="Fira Code Retina"/>
+          <w:sz w:val="20"/>
+          <w:szCs w:val="20"/>
+        </w:rPr>
+        <w:t xml:space="preserve"> status </w:t>
+      </w:r>
+      <w:proofErr w:type="spellStart"/>
+      <w:r>
+        <w:rPr>
+          <w:rFonts w:ascii="Fira Code Retina" w:hAnsi="Fira Code Retina" w:cs="Fira Code Retina"/>
+          <w:sz w:val="20"/>
+          <w:szCs w:val="20"/>
+        </w:rPr>
+        <w:t>firewalld</w:t>
+      </w:r>
+      <w:proofErr w:type="spellEnd"/>
     </w:p>
     <w:p>
       <w:pPr>
@@ -988,21 +1696,41 @@
           <w:szCs w:val="20"/>
         </w:rPr>
       </w:pPr>
-      <w:r>
-        <w:rPr>
-          <w:rFonts w:ascii="Fira Code Retina" w:hAnsi="Fira Code Retina" w:cs="Fira Code Retina"/>
-          <w:sz w:val="20"/>
-          <w:szCs w:val="20"/>
-        </w:rPr>
-        <w:t>sudo nano /etc/</w:t>
-      </w:r>
-      <w:r>
-        <w:rPr>
-          <w:rFonts w:ascii="Fira Code Retina" w:hAnsi="Fira Code Retina" w:cs="Fira Code Retina"/>
-          <w:sz w:val="20"/>
-          <w:szCs w:val="20"/>
-        </w:rPr>
-        <w:t>sysctl.d/99-</w:t>
+      <w:proofErr w:type="spellStart"/>
+      <w:r>
+        <w:rPr>
+          <w:rFonts w:ascii="Fira Code Retina" w:hAnsi="Fira Code Retina" w:cs="Fira Code Retina"/>
+          <w:sz w:val="20"/>
+          <w:szCs w:val="20"/>
+        </w:rPr>
+        <w:t>sudo</w:t>
+      </w:r>
+      <w:proofErr w:type="spellEnd"/>
+      <w:r>
+        <w:rPr>
+          <w:rFonts w:ascii="Fira Code Retina" w:hAnsi="Fira Code Retina" w:cs="Fira Code Retina"/>
+          <w:sz w:val="20"/>
+          <w:szCs w:val="20"/>
+        </w:rPr>
+        <w:t xml:space="preserve"> nano /etc/</w:t>
+      </w:r>
+      <w:proofErr w:type="spellStart"/>
+      <w:r>
+        <w:rPr>
+          <w:rFonts w:ascii="Fira Code Retina" w:hAnsi="Fira Code Retina" w:cs="Fira Code Retina"/>
+          <w:sz w:val="20"/>
+          <w:szCs w:val="20"/>
+        </w:rPr>
+        <w:t>sysctl.d</w:t>
+      </w:r>
+      <w:proofErr w:type="spellEnd"/>
+      <w:r>
+        <w:rPr>
+          <w:rFonts w:ascii="Fira Code Retina" w:hAnsi="Fira Code Retina" w:cs="Fira Code Retina"/>
+          <w:sz w:val="20"/>
+          <w:szCs w:val="20"/>
+        </w:rPr>
+        <w:t>/99-</w:t>
       </w:r>
       <w:r>
         <w:rPr>
@@ -1033,13 +1761,23 @@
           <w:szCs w:val="20"/>
         </w:rPr>
       </w:pPr>
-      <w:r>
-        <w:rPr>
-          <w:rFonts w:ascii="Fira Code Retina" w:hAnsi="Fira Code Retina" w:cs="Fira Code Retina"/>
-          <w:sz w:val="20"/>
-          <w:szCs w:val="20"/>
-        </w:rPr>
-        <w:t>net.ipv4.ip_forward=1</w:t>
+      <w:proofErr w:type="gramStart"/>
+      <w:r>
+        <w:rPr>
+          <w:rFonts w:ascii="Fira Code Retina" w:hAnsi="Fira Code Retina" w:cs="Fira Code Retina"/>
+          <w:sz w:val="20"/>
+          <w:szCs w:val="20"/>
+        </w:rPr>
+        <w:t>net.ipv4.ip</w:t>
+      </w:r>
+      <w:proofErr w:type="gramEnd"/>
+      <w:r>
+        <w:rPr>
+          <w:rFonts w:ascii="Fira Code Retina" w:hAnsi="Fira Code Retina" w:cs="Fira Code Retina"/>
+          <w:sz w:val="20"/>
+          <w:szCs w:val="20"/>
+        </w:rPr>
+        <w:t>_forward=1</w:t>
       </w:r>
     </w:p>
     <w:p>
@@ -1064,24 +1802,60 @@
         <w:spacing w:after="0"/>
       </w:pPr>
       <w:r>
-        <w:t>Next, set up netplan with static addresses:</w:t>
-      </w:r>
-    </w:p>
-    <w:p>
-      <w:pPr>
-        <w:rPr>
-          <w:rFonts w:ascii="Fira Code Retina" w:hAnsi="Fira Code Retina" w:cs="Fira Code Retina"/>
-          <w:sz w:val="20"/>
-          <w:szCs w:val="20"/>
-        </w:rPr>
-      </w:pPr>
-      <w:r>
-        <w:rPr>
-          <w:rFonts w:ascii="Fira Code Retina" w:hAnsi="Fira Code Retina" w:cs="Fira Code Retina"/>
-          <w:sz w:val="20"/>
-          <w:szCs w:val="20"/>
-        </w:rPr>
-        <w:t>sudo nano /etc/netplan/</w:t>
+        <w:t xml:space="preserve">Next, set up </w:t>
+      </w:r>
+      <w:proofErr w:type="spellStart"/>
+      <w:r>
+        <w:t>netplan</w:t>
+      </w:r>
+      <w:proofErr w:type="spellEnd"/>
+      <w:r>
+        <w:t xml:space="preserve"> with static addresses:</w:t>
+      </w:r>
+    </w:p>
+    <w:p>
+      <w:pPr>
+        <w:rPr>
+          <w:rFonts w:ascii="Fira Code Retina" w:hAnsi="Fira Code Retina" w:cs="Fira Code Retina"/>
+          <w:sz w:val="20"/>
+          <w:szCs w:val="20"/>
+        </w:rPr>
+      </w:pPr>
+      <w:proofErr w:type="spellStart"/>
+      <w:r>
+        <w:rPr>
+          <w:rFonts w:ascii="Fira Code Retina" w:hAnsi="Fira Code Retina" w:cs="Fira Code Retina"/>
+          <w:sz w:val="20"/>
+          <w:szCs w:val="20"/>
+        </w:rPr>
+        <w:t>sudo</w:t>
+      </w:r>
+      <w:proofErr w:type="spellEnd"/>
+      <w:r>
+        <w:rPr>
+          <w:rFonts w:ascii="Fira Code Retina" w:hAnsi="Fira Code Retina" w:cs="Fira Code Retina"/>
+          <w:sz w:val="20"/>
+          <w:szCs w:val="20"/>
+        </w:rPr>
+        <w:t xml:space="preserve"> nano /etc/</w:t>
+      </w:r>
+      <w:proofErr w:type="spellStart"/>
+      <w:r>
+        <w:rPr>
+          <w:rFonts w:ascii="Fira Code Retina" w:hAnsi="Fira Code Retina" w:cs="Fira Code Retina"/>
+          <w:sz w:val="20"/>
+          <w:szCs w:val="20"/>
+        </w:rPr>
+        <w:t>netplan</w:t>
+      </w:r>
+      <w:proofErr w:type="spellEnd"/>
+      <w:r>
+        <w:rPr>
+          <w:rFonts w:ascii="Fira Code Retina" w:hAnsi="Fira Code Retina" w:cs="Fira Code Retina"/>
+          <w:sz w:val="20"/>
+          <w:szCs w:val="20"/>
+        </w:rPr>
+        <w:t>/</w:t>
       </w:r>
       <w:r>
         <w:rPr>
@@ -1723,7 +2497,25 @@
           <w:sz w:val="20"/>
           <w:szCs w:val="20"/>
         </w:rPr>
-        <w:t>- to: 192.168.20.0/24</w:t>
+        <w:t xml:space="preserve">- </w:t>
+      </w:r>
+      <w:proofErr w:type="gramStart"/>
+      <w:r>
+        <w:rPr>
+          <w:rFonts w:ascii="Fira Code Retina" w:hAnsi="Fira Code Retina" w:cs="Fira Code Retina"/>
+          <w:sz w:val="20"/>
+          <w:szCs w:val="20"/>
+        </w:rPr>
+        <w:t>to:</w:t>
+      </w:r>
+      <w:proofErr w:type="gramEnd"/>
+      <w:r>
+        <w:rPr>
+          <w:rFonts w:ascii="Fira Code Retina" w:hAnsi="Fira Code Retina" w:cs="Fira Code Retina"/>
+          <w:sz w:val="20"/>
+          <w:szCs w:val="20"/>
+        </w:rPr>
+        <w:t xml:space="preserve"> 192.168.20.0/24</w:t>
       </w:r>
     </w:p>
     <w:p>
@@ -1751,13 +2543,23 @@
         </w:rPr>
         <w:t xml:space="preserve">  </w:t>
       </w:r>
-      <w:r>
-        <w:rPr>
-          <w:rFonts w:ascii="Fira Code Retina" w:hAnsi="Fira Code Retina" w:cs="Fira Code Retina"/>
-          <w:sz w:val="20"/>
-          <w:szCs w:val="20"/>
-        </w:rPr>
-        <w:t>via: 192.168.10.1</w:t>
+      <w:proofErr w:type="gramStart"/>
+      <w:r>
+        <w:rPr>
+          <w:rFonts w:ascii="Fira Code Retina" w:hAnsi="Fira Code Retina" w:cs="Fira Code Retina"/>
+          <w:sz w:val="20"/>
+          <w:szCs w:val="20"/>
+        </w:rPr>
+        <w:t>via:</w:t>
+      </w:r>
+      <w:proofErr w:type="gramEnd"/>
+      <w:r>
+        <w:rPr>
+          <w:rFonts w:ascii="Fira Code Retina" w:hAnsi="Fira Code Retina" w:cs="Fira Code Retina"/>
+          <w:sz w:val="20"/>
+          <w:szCs w:val="20"/>
+        </w:rPr>
+        <w:t xml:space="preserve"> 192.168.10.1</w:t>
       </w:r>
     </w:p>
     <w:p>
@@ -1783,7 +2585,25 @@
           <w:sz w:val="20"/>
           <w:szCs w:val="20"/>
         </w:rPr>
-        <w:t xml:space="preserve">      - to: 192.168.30.0/24</w:t>
+        <w:t xml:space="preserve">      - </w:t>
+      </w:r>
+      <w:proofErr w:type="gramStart"/>
+      <w:r>
+        <w:rPr>
+          <w:rFonts w:ascii="Fira Code Retina" w:hAnsi="Fira Code Retina" w:cs="Fira Code Retina"/>
+          <w:sz w:val="20"/>
+          <w:szCs w:val="20"/>
+        </w:rPr>
+        <w:t>to:</w:t>
+      </w:r>
+      <w:proofErr w:type="gramEnd"/>
+      <w:r>
+        <w:rPr>
+          <w:rFonts w:ascii="Fira Code Retina" w:hAnsi="Fira Code Retina" w:cs="Fira Code Retina"/>
+          <w:sz w:val="20"/>
+          <w:szCs w:val="20"/>
+        </w:rPr>
+        <w:t xml:space="preserve"> 192.168.30.0/24</w:t>
       </w:r>
     </w:p>
     <w:p>
@@ -1817,7 +2637,25 @@
           <w:sz w:val="20"/>
           <w:szCs w:val="20"/>
         </w:rPr>
-        <w:t xml:space="preserve">      via: 192.168.10.1</w:t>
+        <w:t xml:space="preserve">      </w:t>
+      </w:r>
+      <w:proofErr w:type="gramStart"/>
+      <w:r>
+        <w:rPr>
+          <w:rFonts w:ascii="Fira Code Retina" w:hAnsi="Fira Code Retina" w:cs="Fira Code Retina"/>
+          <w:sz w:val="20"/>
+          <w:szCs w:val="20"/>
+        </w:rPr>
+        <w:t>via:</w:t>
+      </w:r>
+      <w:proofErr w:type="gramEnd"/>
+      <w:r>
+        <w:rPr>
+          <w:rFonts w:ascii="Fira Code Retina" w:hAnsi="Fira Code Retina" w:cs="Fira Code Retina"/>
+          <w:sz w:val="20"/>
+          <w:szCs w:val="20"/>
+        </w:rPr>
+        <w:t xml:space="preserve"> 192.168.10.1</w:t>
       </w:r>
     </w:p>
     <w:p>
@@ -1851,7 +2689,25 @@
           <w:sz w:val="20"/>
           <w:szCs w:val="20"/>
         </w:rPr>
-        <w:t xml:space="preserve">  - to: fd00:0:0:20::/64</w:t>
+        <w:t xml:space="preserve">  - to: fd00:0:0:</w:t>
+      </w:r>
+      <w:proofErr w:type="gramStart"/>
+      <w:r>
+        <w:rPr>
+          <w:rFonts w:ascii="Fira Code Retina" w:hAnsi="Fira Code Retina" w:cs="Fira Code Retina"/>
+          <w:sz w:val="20"/>
+          <w:szCs w:val="20"/>
+        </w:rPr>
+        <w:t>20::/</w:t>
+      </w:r>
+      <w:proofErr w:type="gramEnd"/>
+      <w:r>
+        <w:rPr>
+          <w:rFonts w:ascii="Fira Code Retina" w:hAnsi="Fira Code Retina" w:cs="Fira Code Retina"/>
+          <w:sz w:val="20"/>
+          <w:szCs w:val="20"/>
+        </w:rPr>
+        <w:t>64</w:t>
       </w:r>
     </w:p>
     <w:p>
@@ -1903,7 +2759,25 @@
           <w:sz w:val="20"/>
           <w:szCs w:val="20"/>
         </w:rPr>
-        <w:t>- to: fd00:0:0:30::/64</w:t>
+        <w:t>- to: fd00:0:0:</w:t>
+      </w:r>
+      <w:proofErr w:type="gramStart"/>
+      <w:r>
+        <w:rPr>
+          <w:rFonts w:ascii="Fira Code Retina" w:hAnsi="Fira Code Retina" w:cs="Fira Code Retina"/>
+          <w:sz w:val="20"/>
+          <w:szCs w:val="20"/>
+        </w:rPr>
+        <w:t>30::/</w:t>
+      </w:r>
+      <w:proofErr w:type="gramEnd"/>
+      <w:r>
+        <w:rPr>
+          <w:rFonts w:ascii="Fira Code Retina" w:hAnsi="Fira Code Retina" w:cs="Fira Code Retina"/>
+          <w:sz w:val="20"/>
+          <w:szCs w:val="20"/>
+        </w:rPr>
+        <w:t>64</w:t>
       </w:r>
     </w:p>
     <w:p>
@@ -2005,6 +2879,7 @@
         </w:rPr>
         <w:t xml:space="preserve">  renderer: </w:t>
       </w:r>
+      <w:proofErr w:type="spellStart"/>
       <w:r>
         <w:rPr>
           <w:rFonts w:ascii="Fira Code Retina" w:hAnsi="Fira Code Retina" w:cs="Fira Code Retina"/>
@@ -2013,6 +2888,7 @@
         </w:rPr>
         <w:t>networkd</w:t>
       </w:r>
+      <w:proofErr w:type="spellEnd"/>
     </w:p>
     <w:p>
       <w:pPr>
@@ -2417,7 +3293,25 @@
           <w:sz w:val="20"/>
           <w:szCs w:val="20"/>
         </w:rPr>
-        <w:t>- to: 192.168.30.0/24</w:t>
+        <w:t xml:space="preserve">- </w:t>
+      </w:r>
+      <w:proofErr w:type="gramStart"/>
+      <w:r>
+        <w:rPr>
+          <w:rFonts w:ascii="Fira Code Retina" w:hAnsi="Fira Code Retina" w:cs="Fira Code Retina"/>
+          <w:sz w:val="20"/>
+          <w:szCs w:val="20"/>
+        </w:rPr>
+        <w:t>to:</w:t>
+      </w:r>
+      <w:proofErr w:type="gramEnd"/>
+      <w:r>
+        <w:rPr>
+          <w:rFonts w:ascii="Fira Code Retina" w:hAnsi="Fira Code Retina" w:cs="Fira Code Retina"/>
+          <w:sz w:val="20"/>
+          <w:szCs w:val="20"/>
+        </w:rPr>
+        <w:t xml:space="preserve"> 192.168.30.0/24</w:t>
       </w:r>
     </w:p>
     <w:p>
@@ -2445,13 +3339,23 @@
         </w:rPr>
         <w:t xml:space="preserve">  </w:t>
       </w:r>
-      <w:r>
-        <w:rPr>
-          <w:rFonts w:ascii="Fira Code Retina" w:hAnsi="Fira Code Retina" w:cs="Fira Code Retina"/>
-          <w:sz w:val="20"/>
-          <w:szCs w:val="20"/>
-        </w:rPr>
-        <w:t>via: 192.168.20.2</w:t>
+      <w:proofErr w:type="gramStart"/>
+      <w:r>
+        <w:rPr>
+          <w:rFonts w:ascii="Fira Code Retina" w:hAnsi="Fira Code Retina" w:cs="Fira Code Retina"/>
+          <w:sz w:val="20"/>
+          <w:szCs w:val="20"/>
+        </w:rPr>
+        <w:t>via:</w:t>
+      </w:r>
+      <w:proofErr w:type="gramEnd"/>
+      <w:r>
+        <w:rPr>
+          <w:rFonts w:ascii="Fira Code Retina" w:hAnsi="Fira Code Retina" w:cs="Fira Code Retina"/>
+          <w:sz w:val="20"/>
+          <w:szCs w:val="20"/>
+        </w:rPr>
+        <w:t xml:space="preserve"> 192.168.20.2</w:t>
       </w:r>
     </w:p>
     <w:p>
@@ -2477,7 +3381,25 @@
           <w:sz w:val="20"/>
           <w:szCs w:val="20"/>
         </w:rPr>
-        <w:t xml:space="preserve">  - to: fd00:0:0:30::/64</w:t>
+        <w:t xml:space="preserve">  - to: fd00:0:0:</w:t>
+      </w:r>
+      <w:proofErr w:type="gramStart"/>
+      <w:r>
+        <w:rPr>
+          <w:rFonts w:ascii="Fira Code Retina" w:hAnsi="Fira Code Retina" w:cs="Fira Code Retina"/>
+          <w:sz w:val="20"/>
+          <w:szCs w:val="20"/>
+        </w:rPr>
+        <w:t>30::/</w:t>
+      </w:r>
+      <w:proofErr w:type="gramEnd"/>
+      <w:r>
+        <w:rPr>
+          <w:rFonts w:ascii="Fira Code Retina" w:hAnsi="Fira Code Retina" w:cs="Fira Code Retina"/>
+          <w:sz w:val="20"/>
+          <w:szCs w:val="20"/>
+        </w:rPr>
+        <w:t>64</w:t>
       </w:r>
     </w:p>
     <w:p>
@@ -2577,8 +3499,18 @@
           <w:sz w:val="20"/>
           <w:szCs w:val="20"/>
         </w:rPr>
-        <w:t xml:space="preserve">  renderer: networkd</w:t>
-      </w:r>
+        <w:t xml:space="preserve">  renderer: </w:t>
+      </w:r>
+      <w:proofErr w:type="spellStart"/>
+      <w:r>
+        <w:rPr>
+          <w:rFonts w:ascii="Fira Code Retina" w:hAnsi="Fira Code Retina" w:cs="Fira Code Retina"/>
+          <w:sz w:val="20"/>
+          <w:szCs w:val="20"/>
+        </w:rPr>
+        <w:t>networkd</w:t>
+      </w:r>
+      <w:proofErr w:type="spellEnd"/>
     </w:p>
     <w:p>
       <w:pPr>
@@ -2803,25 +3735,61 @@
           <w:sz w:val="20"/>
           <w:szCs w:val="20"/>
         </w:rPr>
-        <w:t>- to: 192.168.10.0/24</w:t>
-      </w:r>
-    </w:p>
-    <w:p>
-      <w:pPr>
-        <w:spacing w:after="0"/>
-        <w:rPr>
-          <w:rFonts w:ascii="Fira Code Retina" w:hAnsi="Fira Code Retina" w:cs="Fira Code Retina"/>
-          <w:sz w:val="20"/>
-          <w:szCs w:val="20"/>
-        </w:rPr>
-      </w:pPr>
-      <w:r>
-        <w:rPr>
-          <w:rFonts w:ascii="Fira Code Retina" w:hAnsi="Fira Code Retina" w:cs="Fira Code Retina"/>
-          <w:sz w:val="20"/>
-          <w:szCs w:val="20"/>
-        </w:rPr>
-        <w:t xml:space="preserve">          via: 192.168.20.1</w:t>
+        <w:t xml:space="preserve">- </w:t>
+      </w:r>
+      <w:proofErr w:type="gramStart"/>
+      <w:r>
+        <w:rPr>
+          <w:rFonts w:ascii="Fira Code Retina" w:hAnsi="Fira Code Retina" w:cs="Fira Code Retina"/>
+          <w:sz w:val="20"/>
+          <w:szCs w:val="20"/>
+        </w:rPr>
+        <w:t>to:</w:t>
+      </w:r>
+      <w:proofErr w:type="gramEnd"/>
+      <w:r>
+        <w:rPr>
+          <w:rFonts w:ascii="Fira Code Retina" w:hAnsi="Fira Code Retina" w:cs="Fira Code Retina"/>
+          <w:sz w:val="20"/>
+          <w:szCs w:val="20"/>
+        </w:rPr>
+        <w:t xml:space="preserve"> 192.168.10.0/24</w:t>
+      </w:r>
+    </w:p>
+    <w:p>
+      <w:pPr>
+        <w:spacing w:after="0"/>
+        <w:rPr>
+          <w:rFonts w:ascii="Fira Code Retina" w:hAnsi="Fira Code Retina" w:cs="Fira Code Retina"/>
+          <w:sz w:val="20"/>
+          <w:szCs w:val="20"/>
+        </w:rPr>
+      </w:pPr>
+      <w:r>
+        <w:rPr>
+          <w:rFonts w:ascii="Fira Code Retina" w:hAnsi="Fira Code Retina" w:cs="Fira Code Retina"/>
+          <w:sz w:val="20"/>
+          <w:szCs w:val="20"/>
+        </w:rPr>
+        <w:t xml:space="preserve">          </w:t>
+      </w:r>
+      <w:proofErr w:type="gramStart"/>
+      <w:r>
+        <w:rPr>
+          <w:rFonts w:ascii="Fira Code Retina" w:hAnsi="Fira Code Retina" w:cs="Fira Code Retina"/>
+          <w:sz w:val="20"/>
+          <w:szCs w:val="20"/>
+        </w:rPr>
+        <w:t>via:</w:t>
+      </w:r>
+      <w:proofErr w:type="gramEnd"/>
+      <w:r>
+        <w:rPr>
+          <w:rFonts w:ascii="Fira Code Retina" w:hAnsi="Fira Code Retina" w:cs="Fira Code Retina"/>
+          <w:sz w:val="20"/>
+          <w:szCs w:val="20"/>
+        </w:rPr>
+        <w:t xml:space="preserve"> 192.168.20.1</w:t>
       </w:r>
     </w:p>
     <w:p>
@@ -2863,7 +3831,25 @@
           <w:sz w:val="20"/>
           <w:szCs w:val="20"/>
         </w:rPr>
-        <w:t>- to: fd00:0:0:10::/64</w:t>
+        <w:t>- to: fd00:0:0:</w:t>
+      </w:r>
+      <w:proofErr w:type="gramStart"/>
+      <w:r>
+        <w:rPr>
+          <w:rFonts w:ascii="Fira Code Retina" w:hAnsi="Fira Code Retina" w:cs="Fira Code Retina"/>
+          <w:sz w:val="20"/>
+          <w:szCs w:val="20"/>
+        </w:rPr>
+        <w:t>10::/</w:t>
+      </w:r>
+      <w:proofErr w:type="gramEnd"/>
+      <w:r>
+        <w:rPr>
+          <w:rFonts w:ascii="Fira Code Retina" w:hAnsi="Fira Code Retina" w:cs="Fira Code Retina"/>
+          <w:sz w:val="20"/>
+          <w:szCs w:val="20"/>
+        </w:rPr>
+        <w:t>64</w:t>
       </w:r>
     </w:p>
     <w:p>
@@ -3280,7 +4266,25 @@
           <w:sz w:val="20"/>
           <w:szCs w:val="20"/>
         </w:rPr>
-        <w:t xml:space="preserve">        - to: 192.168.10.0/24</w:t>
+        <w:t xml:space="preserve">        - </w:t>
+      </w:r>
+      <w:proofErr w:type="gramStart"/>
+      <w:r>
+        <w:rPr>
+          <w:rFonts w:ascii="Fira Code Retina" w:hAnsi="Fira Code Retina" w:cs="Fira Code Retina"/>
+          <w:sz w:val="20"/>
+          <w:szCs w:val="20"/>
+        </w:rPr>
+        <w:t>to:</w:t>
+      </w:r>
+      <w:proofErr w:type="gramEnd"/>
+      <w:r>
+        <w:rPr>
+          <w:rFonts w:ascii="Fira Code Retina" w:hAnsi="Fira Code Retina" w:cs="Fira Code Retina"/>
+          <w:sz w:val="20"/>
+          <w:szCs w:val="20"/>
+        </w:rPr>
+        <w:t xml:space="preserve"> 192.168.10.0/24</w:t>
       </w:r>
     </w:p>
     <w:p>
@@ -3308,31 +4312,59 @@
         </w:rPr>
         <w:t xml:space="preserve">  </w:t>
       </w:r>
-      <w:r>
-        <w:rPr>
-          <w:rFonts w:ascii="Fira Code Retina" w:hAnsi="Fira Code Retina" w:cs="Fira Code Retina"/>
-          <w:sz w:val="20"/>
-          <w:szCs w:val="20"/>
-        </w:rPr>
-        <w:t>via: 192.168.30.1</w:t>
-      </w:r>
-    </w:p>
-    <w:p>
-      <w:pPr>
-        <w:spacing w:after="0"/>
-        <w:rPr>
-          <w:rFonts w:ascii="Fira Code Retina" w:hAnsi="Fira Code Retina" w:cs="Fira Code Retina"/>
-          <w:sz w:val="20"/>
-          <w:szCs w:val="20"/>
-        </w:rPr>
-      </w:pPr>
-      <w:r>
-        <w:rPr>
-          <w:rFonts w:ascii="Fira Code Retina" w:hAnsi="Fira Code Retina" w:cs="Fira Code Retina"/>
-          <w:sz w:val="20"/>
-          <w:szCs w:val="20"/>
-        </w:rPr>
-        <w:t xml:space="preserve">        - to: 192.168.20.0/24</w:t>
+      <w:proofErr w:type="gramStart"/>
+      <w:r>
+        <w:rPr>
+          <w:rFonts w:ascii="Fira Code Retina" w:hAnsi="Fira Code Retina" w:cs="Fira Code Retina"/>
+          <w:sz w:val="20"/>
+          <w:szCs w:val="20"/>
+        </w:rPr>
+        <w:t>via:</w:t>
+      </w:r>
+      <w:proofErr w:type="gramEnd"/>
+      <w:r>
+        <w:rPr>
+          <w:rFonts w:ascii="Fira Code Retina" w:hAnsi="Fira Code Retina" w:cs="Fira Code Retina"/>
+          <w:sz w:val="20"/>
+          <w:szCs w:val="20"/>
+        </w:rPr>
+        <w:t xml:space="preserve"> 192.168.30.1</w:t>
+      </w:r>
+    </w:p>
+    <w:p>
+      <w:pPr>
+        <w:spacing w:after="0"/>
+        <w:rPr>
+          <w:rFonts w:ascii="Fira Code Retina" w:hAnsi="Fira Code Retina" w:cs="Fira Code Retina"/>
+          <w:sz w:val="20"/>
+          <w:szCs w:val="20"/>
+        </w:rPr>
+      </w:pPr>
+      <w:r>
+        <w:rPr>
+          <w:rFonts w:ascii="Fira Code Retina" w:hAnsi="Fira Code Retina" w:cs="Fira Code Retina"/>
+          <w:sz w:val="20"/>
+          <w:szCs w:val="20"/>
+        </w:rPr>
+        <w:t xml:space="preserve">        - </w:t>
+      </w:r>
+      <w:proofErr w:type="gramStart"/>
+      <w:r>
+        <w:rPr>
+          <w:rFonts w:ascii="Fira Code Retina" w:hAnsi="Fira Code Retina" w:cs="Fira Code Retina"/>
+          <w:sz w:val="20"/>
+          <w:szCs w:val="20"/>
+        </w:rPr>
+        <w:t>to:</w:t>
+      </w:r>
+      <w:proofErr w:type="gramEnd"/>
+      <w:r>
+        <w:rPr>
+          <w:rFonts w:ascii="Fira Code Retina" w:hAnsi="Fira Code Retina" w:cs="Fira Code Retina"/>
+          <w:sz w:val="20"/>
+          <w:szCs w:val="20"/>
+        </w:rPr>
+        <w:t xml:space="preserve"> 192.168.20.0/24</w:t>
       </w:r>
     </w:p>
     <w:p>
@@ -3360,31 +4392,59 @@
         </w:rPr>
         <w:t xml:space="preserve">  </w:t>
       </w:r>
-      <w:r>
-        <w:rPr>
-          <w:rFonts w:ascii="Fira Code Retina" w:hAnsi="Fira Code Retina" w:cs="Fira Code Retina"/>
-          <w:sz w:val="20"/>
-          <w:szCs w:val="20"/>
-        </w:rPr>
-        <w:t>via: 192.168.30.1</w:t>
-      </w:r>
-    </w:p>
-    <w:p>
-      <w:pPr>
-        <w:spacing w:after="0"/>
-        <w:rPr>
-          <w:rFonts w:ascii="Fira Code Retina" w:hAnsi="Fira Code Retina" w:cs="Fira Code Retina"/>
-          <w:sz w:val="20"/>
-          <w:szCs w:val="20"/>
-        </w:rPr>
-      </w:pPr>
-      <w:r>
-        <w:rPr>
-          <w:rFonts w:ascii="Fira Code Retina" w:hAnsi="Fira Code Retina" w:cs="Fira Code Retina"/>
-          <w:sz w:val="20"/>
-          <w:szCs w:val="20"/>
-        </w:rPr>
-        <w:t xml:space="preserve">        - to: fd00:0:0:10::/64</w:t>
+      <w:proofErr w:type="gramStart"/>
+      <w:r>
+        <w:rPr>
+          <w:rFonts w:ascii="Fira Code Retina" w:hAnsi="Fira Code Retina" w:cs="Fira Code Retina"/>
+          <w:sz w:val="20"/>
+          <w:szCs w:val="20"/>
+        </w:rPr>
+        <w:t>via:</w:t>
+      </w:r>
+      <w:proofErr w:type="gramEnd"/>
+      <w:r>
+        <w:rPr>
+          <w:rFonts w:ascii="Fira Code Retina" w:hAnsi="Fira Code Retina" w:cs="Fira Code Retina"/>
+          <w:sz w:val="20"/>
+          <w:szCs w:val="20"/>
+        </w:rPr>
+        <w:t xml:space="preserve"> 192.168.30.1</w:t>
+      </w:r>
+    </w:p>
+    <w:p>
+      <w:pPr>
+        <w:spacing w:after="0"/>
+        <w:rPr>
+          <w:rFonts w:ascii="Fira Code Retina" w:hAnsi="Fira Code Retina" w:cs="Fira Code Retina"/>
+          <w:sz w:val="20"/>
+          <w:szCs w:val="20"/>
+        </w:rPr>
+      </w:pPr>
+      <w:r>
+        <w:rPr>
+          <w:rFonts w:ascii="Fira Code Retina" w:hAnsi="Fira Code Retina" w:cs="Fira Code Retina"/>
+          <w:sz w:val="20"/>
+          <w:szCs w:val="20"/>
+        </w:rPr>
+        <w:t xml:space="preserve">        - to: fd00:0:0:</w:t>
+      </w:r>
+      <w:proofErr w:type="gramStart"/>
+      <w:r>
+        <w:rPr>
+          <w:rFonts w:ascii="Fira Code Retina" w:hAnsi="Fira Code Retina" w:cs="Fira Code Retina"/>
+          <w:sz w:val="20"/>
+          <w:szCs w:val="20"/>
+        </w:rPr>
+        <w:t>10::/</w:t>
+      </w:r>
+      <w:proofErr w:type="gramEnd"/>
+      <w:r>
+        <w:rPr>
+          <w:rFonts w:ascii="Fira Code Retina" w:hAnsi="Fira Code Retina" w:cs="Fira Code Retina"/>
+          <w:sz w:val="20"/>
+          <w:szCs w:val="20"/>
+        </w:rPr>
+        <w:t>64</w:t>
       </w:r>
     </w:p>
     <w:p>
@@ -3436,7 +4496,25 @@
           <w:sz w:val="20"/>
           <w:szCs w:val="20"/>
         </w:rPr>
-        <w:t xml:space="preserve">        - to: fd00:0:0:20::/64</w:t>
+        <w:t xml:space="preserve">        - to: fd00:0:0:</w:t>
+      </w:r>
+      <w:proofErr w:type="gramStart"/>
+      <w:r>
+        <w:rPr>
+          <w:rFonts w:ascii="Fira Code Retina" w:hAnsi="Fira Code Retina" w:cs="Fira Code Retina"/>
+          <w:sz w:val="20"/>
+          <w:szCs w:val="20"/>
+        </w:rPr>
+        <w:t>20::/</w:t>
+      </w:r>
+      <w:proofErr w:type="gramEnd"/>
+      <w:r>
+        <w:rPr>
+          <w:rFonts w:ascii="Fira Code Retina" w:hAnsi="Fira Code Retina" w:cs="Fira Code Retina"/>
+          <w:sz w:val="20"/>
+          <w:szCs w:val="20"/>
+        </w:rPr>
+        <w:t>64</w:t>
       </w:r>
     </w:p>
     <w:p>
@@ -3513,11 +4591,20 @@
       </w:pPr>
       <w:r>
         <w:lastRenderedPageBreak/>
-        <w:t>Create a new systemd service unit to a</w:t>
+        <w:t xml:space="preserve">Create a new </w:t>
+      </w:r>
+      <w:proofErr w:type="spellStart"/>
+      <w:r>
+        <w:t>systemd</w:t>
+      </w:r>
+      <w:proofErr w:type="spellEnd"/>
+      <w:r>
+        <w:t xml:space="preserve"> service unit to a</w:t>
       </w:r>
       <w:r>
         <w:t xml:space="preserve">pply </w:t>
       </w:r>
+      <w:proofErr w:type="spellStart"/>
       <w:r>
         <w:rPr>
           <w:rFonts w:ascii="Fira Code Retina" w:hAnsi="Fira Code Retina" w:cs="Fira Code Retina"/>
@@ -3526,6 +4613,7 @@
         </w:rPr>
         <w:t>netplan</w:t>
       </w:r>
+      <w:proofErr w:type="spellEnd"/>
       <w:r>
         <w:t xml:space="preserve"> at boot:</w:t>
       </w:r>
@@ -3539,6 +4627,7 @@
           <w:szCs w:val="20"/>
         </w:rPr>
       </w:pPr>
+      <w:proofErr w:type="spellStart"/>
       <w:r>
         <w:rPr>
           <w:rFonts w:ascii="Fira Code Retina" w:hAnsi="Fira Code Retina" w:cs="Fira Code Retina"/>
@@ -3553,8 +4642,45 @@
           <w:sz w:val="20"/>
           <w:szCs w:val="20"/>
         </w:rPr>
-        <w:t>udo nano /etc/systemd/system/netplan-apply.service</w:t>
-      </w:r>
+        <w:t>udo</w:t>
+      </w:r>
+      <w:proofErr w:type="spellEnd"/>
+      <w:r>
+        <w:rPr>
+          <w:rFonts w:ascii="Fira Code Retina" w:hAnsi="Fira Code Retina" w:cs="Fira Code Retina"/>
+          <w:sz w:val="20"/>
+          <w:szCs w:val="20"/>
+        </w:rPr>
+        <w:t xml:space="preserve"> nano /etc/</w:t>
+      </w:r>
+      <w:proofErr w:type="spellStart"/>
+      <w:r>
+        <w:rPr>
+          <w:rFonts w:ascii="Fira Code Retina" w:hAnsi="Fira Code Retina" w:cs="Fira Code Retina"/>
+          <w:sz w:val="20"/>
+          <w:szCs w:val="20"/>
+        </w:rPr>
+        <w:t>systemd</w:t>
+      </w:r>
+      <w:proofErr w:type="spellEnd"/>
+      <w:r>
+        <w:rPr>
+          <w:rFonts w:ascii="Fira Code Retina" w:hAnsi="Fira Code Retina" w:cs="Fira Code Retina"/>
+          <w:sz w:val="20"/>
+          <w:szCs w:val="20"/>
+        </w:rPr>
+        <w:t>/system/</w:t>
+      </w:r>
+      <w:proofErr w:type="spellStart"/>
+      <w:r>
+        <w:rPr>
+          <w:rFonts w:ascii="Fira Code Retina" w:hAnsi="Fira Code Retina" w:cs="Fira Code Retina"/>
+          <w:sz w:val="20"/>
+          <w:szCs w:val="20"/>
+        </w:rPr>
+        <w:t>netplan-apply.service</w:t>
+      </w:r>
+      <w:proofErr w:type="spellEnd"/>
     </w:p>
     <w:p>
       <w:pPr>
@@ -3604,6 +4730,7 @@
         </w:rPr>
         <w:t xml:space="preserve">Description=Apply </w:t>
       </w:r>
+      <w:proofErr w:type="spellStart"/>
       <w:r>
         <w:rPr>
           <w:rFonts w:ascii="Fira Code Retina" w:hAnsi="Fira Code Retina" w:cs="Fira Code Retina"/>
@@ -3618,7 +4745,16 @@
           <w:sz w:val="20"/>
           <w:szCs w:val="20"/>
         </w:rPr>
-        <w:t xml:space="preserve">etplan </w:t>
+        <w:t>etplan</w:t>
+      </w:r>
+      <w:proofErr w:type="spellEnd"/>
+      <w:r>
+        <w:rPr>
+          <w:rFonts w:ascii="Fira Code Retina" w:hAnsi="Fira Code Retina" w:cs="Fira Code Retina"/>
+          <w:sz w:val="20"/>
+          <w:szCs w:val="20"/>
+        </w:rPr>
+        <w:t xml:space="preserve"> </w:t>
       </w:r>
       <w:r>
         <w:rPr>
@@ -3668,8 +4804,18 @@
           <w:sz w:val="20"/>
           <w:szCs w:val="20"/>
         </w:rPr>
-        <w:t>After=network.target</w:t>
-      </w:r>
+        <w:t>After=</w:t>
+      </w:r>
+      <w:proofErr w:type="spellStart"/>
+      <w:r>
+        <w:rPr>
+          <w:rFonts w:ascii="Fira Code Retina" w:hAnsi="Fira Code Retina" w:cs="Fira Code Retina"/>
+          <w:sz w:val="20"/>
+          <w:szCs w:val="20"/>
+        </w:rPr>
+        <w:t>network.target</w:t>
+      </w:r>
+      <w:proofErr w:type="spellEnd"/>
     </w:p>
     <w:p>
       <w:pPr>
@@ -3714,25 +4860,81 @@
           <w:sz w:val="20"/>
           <w:szCs w:val="20"/>
         </w:rPr>
-        <w:t>Type=oneshot</w:t>
-      </w:r>
-    </w:p>
-    <w:p>
-      <w:pPr>
-        <w:spacing w:after="0"/>
-        <w:rPr>
-          <w:rFonts w:ascii="Fira Code Retina" w:hAnsi="Fira Code Retina" w:cs="Fira Code Retina"/>
-          <w:sz w:val="20"/>
-          <w:szCs w:val="20"/>
-        </w:rPr>
-      </w:pPr>
-      <w:r>
-        <w:rPr>
-          <w:rFonts w:ascii="Fira Code Retina" w:hAnsi="Fira Code Retina" w:cs="Fira Code Retina"/>
-          <w:sz w:val="20"/>
-          <w:szCs w:val="20"/>
-        </w:rPr>
-        <w:t>ExecStart=/usr/bin/netplan apply</w:t>
+        <w:t>Type=</w:t>
+      </w:r>
+      <w:proofErr w:type="spellStart"/>
+      <w:r>
+        <w:rPr>
+          <w:rFonts w:ascii="Fira Code Retina" w:hAnsi="Fira Code Retina" w:cs="Fira Code Retina"/>
+          <w:sz w:val="20"/>
+          <w:szCs w:val="20"/>
+        </w:rPr>
+        <w:t>oneshot</w:t>
+      </w:r>
+      <w:proofErr w:type="spellEnd"/>
+    </w:p>
+    <w:p>
+      <w:pPr>
+        <w:spacing w:after="0"/>
+        <w:rPr>
+          <w:rFonts w:ascii="Fira Code Retina" w:hAnsi="Fira Code Retina" w:cs="Fira Code Retina"/>
+          <w:sz w:val="20"/>
+          <w:szCs w:val="20"/>
+        </w:rPr>
+      </w:pPr>
+      <w:proofErr w:type="spellStart"/>
+      <w:r>
+        <w:rPr>
+          <w:rFonts w:ascii="Fira Code Retina" w:hAnsi="Fira Code Retina" w:cs="Fira Code Retina"/>
+          <w:sz w:val="20"/>
+          <w:szCs w:val="20"/>
+        </w:rPr>
+        <w:t>ExecStart</w:t>
+      </w:r>
+      <w:proofErr w:type="spellEnd"/>
+      <w:r>
+        <w:rPr>
+          <w:rFonts w:ascii="Fira Code Retina" w:hAnsi="Fira Code Retina" w:cs="Fira Code Retina"/>
+          <w:sz w:val="20"/>
+          <w:szCs w:val="20"/>
+        </w:rPr>
+        <w:t>=/</w:t>
+      </w:r>
+      <w:proofErr w:type="spellStart"/>
+      <w:r>
+        <w:rPr>
+          <w:rFonts w:ascii="Fira Code Retina" w:hAnsi="Fira Code Retina" w:cs="Fira Code Retina"/>
+          <w:sz w:val="20"/>
+          <w:szCs w:val="20"/>
+        </w:rPr>
+        <w:t>usr</w:t>
+      </w:r>
+      <w:proofErr w:type="spellEnd"/>
+      <w:r>
+        <w:rPr>
+          <w:rFonts w:ascii="Fira Code Retina" w:hAnsi="Fira Code Retina" w:cs="Fira Code Retina"/>
+          <w:sz w:val="20"/>
+          <w:szCs w:val="20"/>
+        </w:rPr>
+        <w:t>/bin/</w:t>
+      </w:r>
+      <w:proofErr w:type="spellStart"/>
+      <w:r>
+        <w:rPr>
+          <w:rFonts w:ascii="Fira Code Retina" w:hAnsi="Fira Code Retina" w:cs="Fira Code Retina"/>
+          <w:sz w:val="20"/>
+          <w:szCs w:val="20"/>
+        </w:rPr>
+        <w:t>netplan</w:t>
+      </w:r>
+      <w:proofErr w:type="spellEnd"/>
+      <w:r>
+        <w:rPr>
+          <w:rFonts w:ascii="Fira Code Retina" w:hAnsi="Fira Code Retina" w:cs="Fira Code Retina"/>
+          <w:sz w:val="20"/>
+          <w:szCs w:val="20"/>
+        </w:rPr>
+        <w:t xml:space="preserve"> apply</w:t>
       </w:r>
     </w:p>
     <w:p>
@@ -3772,14 +4974,36 @@
           <w:szCs w:val="20"/>
         </w:rPr>
       </w:pPr>
-      <w:r>
-        <w:rPr>
-          <w:rFonts w:ascii="Fira Code Retina" w:hAnsi="Fira Code Retina" w:cs="Fira Code Retina"/>
-          <w:sz w:val="20"/>
-          <w:szCs w:val="20"/>
-        </w:rPr>
-        <w:t>WantedBy=multi-user.target</w:t>
-      </w:r>
+      <w:proofErr w:type="spellStart"/>
+      <w:r>
+        <w:rPr>
+          <w:rFonts w:ascii="Fira Code Retina" w:hAnsi="Fira Code Retina" w:cs="Fira Code Retina"/>
+          <w:sz w:val="20"/>
+          <w:szCs w:val="20"/>
+        </w:rPr>
+        <w:t>WantedBy</w:t>
+      </w:r>
+      <w:proofErr w:type="spellEnd"/>
+      <w:r>
+        <w:rPr>
+          <w:rFonts w:ascii="Fira Code Retina" w:hAnsi="Fira Code Retina" w:cs="Fira Code Retina"/>
+          <w:sz w:val="20"/>
+          <w:szCs w:val="20"/>
+        </w:rPr>
+        <w:t>=multi-</w:t>
+      </w:r>
+      <w:proofErr w:type="spellStart"/>
+      <w:proofErr w:type="gramStart"/>
+      <w:r>
+        <w:rPr>
+          <w:rFonts w:ascii="Fira Code Retina" w:hAnsi="Fira Code Retina" w:cs="Fira Code Retina"/>
+          <w:sz w:val="20"/>
+          <w:szCs w:val="20"/>
+        </w:rPr>
+        <w:t>user.target</w:t>
+      </w:r>
+      <w:proofErr w:type="spellEnd"/>
+      <w:proofErr w:type="gramEnd"/>
     </w:p>
     <w:p>
       <w:pPr>
@@ -3808,62 +5032,200 @@
         <w:rPr>
           <w:rFonts w:cs="Fira Code Retina"/>
         </w:rPr>
-        <w:t xml:space="preserve"> systemd units and enable/start the new service:</w:t>
-      </w:r>
-    </w:p>
-    <w:p>
-      <w:pPr>
-        <w:spacing w:after="0"/>
-        <w:rPr>
-          <w:rFonts w:ascii="Fira Code Retina" w:hAnsi="Fira Code Retina" w:cs="Fira Code Retina"/>
-          <w:sz w:val="20"/>
-          <w:szCs w:val="20"/>
-        </w:rPr>
-      </w:pPr>
-      <w:r>
-        <w:rPr>
-          <w:rFonts w:ascii="Fira Code Retina" w:hAnsi="Fira Code Retina" w:cs="Fira Code Retina"/>
-          <w:sz w:val="20"/>
-          <w:szCs w:val="20"/>
-        </w:rPr>
-        <w:t>sudo systemctl daemon-reload</w:t>
-      </w:r>
-    </w:p>
-    <w:p>
-      <w:pPr>
-        <w:spacing w:after="0"/>
-        <w:rPr>
-          <w:rFonts w:ascii="Fira Code Retina" w:hAnsi="Fira Code Retina" w:cs="Fira Code Retina"/>
-          <w:sz w:val="20"/>
-          <w:szCs w:val="20"/>
-        </w:rPr>
-      </w:pPr>
-      <w:r>
-        <w:rPr>
-          <w:rFonts w:ascii="Fira Code Retina" w:hAnsi="Fira Code Retina" w:cs="Fira Code Retina"/>
-          <w:sz w:val="20"/>
-          <w:szCs w:val="20"/>
-        </w:rPr>
-        <w:t>sudo systemctl enable netplan-apply.service</w:t>
-      </w:r>
-    </w:p>
-    <w:p>
-      <w:pPr>
-        <w:spacing w:after="0"/>
-        <w:rPr>
-          <w:rFonts w:ascii="Fira Code Retina" w:hAnsi="Fira Code Retina" w:cs="Fira Code Retina"/>
-          <w:sz w:val="20"/>
-          <w:szCs w:val="20"/>
-        </w:rPr>
-      </w:pPr>
-      <w:r>
-        <w:rPr>
-          <w:rFonts w:ascii="Fira Code Retina" w:hAnsi="Fira Code Retina" w:cs="Fira Code Retina"/>
-          <w:sz w:val="20"/>
-          <w:szCs w:val="20"/>
-        </w:rPr>
-        <w:t>sudo systemctl start netplan-apply.service</w:t>
-      </w:r>
+        <w:t xml:space="preserve"> </w:t>
+      </w:r>
+      <w:proofErr w:type="spellStart"/>
+      <w:r>
+        <w:rPr>
+          <w:rFonts w:cs="Fira Code Retina"/>
+        </w:rPr>
+        <w:t>systemd</w:t>
+      </w:r>
+      <w:proofErr w:type="spellEnd"/>
+      <w:r>
+        <w:rPr>
+          <w:rFonts w:cs="Fira Code Retina"/>
+        </w:rPr>
+        <w:t xml:space="preserve"> units and enable/start the new service:</w:t>
+      </w:r>
+    </w:p>
+    <w:p>
+      <w:pPr>
+        <w:spacing w:after="0"/>
+        <w:rPr>
+          <w:rFonts w:ascii="Fira Code Retina" w:hAnsi="Fira Code Retina" w:cs="Fira Code Retina"/>
+          <w:sz w:val="20"/>
+          <w:szCs w:val="20"/>
+        </w:rPr>
+      </w:pPr>
+      <w:proofErr w:type="spellStart"/>
+      <w:r>
+        <w:rPr>
+          <w:rFonts w:ascii="Fira Code Retina" w:hAnsi="Fira Code Retina" w:cs="Fira Code Retina"/>
+          <w:sz w:val="20"/>
+          <w:szCs w:val="20"/>
+        </w:rPr>
+        <w:t>sudo</w:t>
+      </w:r>
+      <w:proofErr w:type="spellEnd"/>
+      <w:r>
+        <w:rPr>
+          <w:rFonts w:ascii="Fira Code Retina" w:hAnsi="Fira Code Retina" w:cs="Fira Code Retina"/>
+          <w:sz w:val="20"/>
+          <w:szCs w:val="20"/>
+        </w:rPr>
+        <w:t xml:space="preserve"> </w:t>
+      </w:r>
+      <w:proofErr w:type="spellStart"/>
+      <w:r>
+        <w:rPr>
+          <w:rFonts w:ascii="Fira Code Retina" w:hAnsi="Fira Code Retina" w:cs="Fira Code Retina"/>
+          <w:sz w:val="20"/>
+          <w:szCs w:val="20"/>
+        </w:rPr>
+        <w:t>systemctl</w:t>
+      </w:r>
+      <w:proofErr w:type="spellEnd"/>
+      <w:r>
+        <w:rPr>
+          <w:rFonts w:ascii="Fira Code Retina" w:hAnsi="Fira Code Retina" w:cs="Fira Code Retina"/>
+          <w:sz w:val="20"/>
+          <w:szCs w:val="20"/>
+        </w:rPr>
+        <w:t xml:space="preserve"> daemon-reload</w:t>
+      </w:r>
+    </w:p>
+    <w:p>
+      <w:pPr>
+        <w:spacing w:after="0"/>
+        <w:rPr>
+          <w:rFonts w:ascii="Fira Code Retina" w:hAnsi="Fira Code Retina" w:cs="Fira Code Retina"/>
+          <w:sz w:val="20"/>
+          <w:szCs w:val="20"/>
+        </w:rPr>
+      </w:pPr>
+      <w:proofErr w:type="spellStart"/>
+      <w:r>
+        <w:rPr>
+          <w:rFonts w:ascii="Fira Code Retina" w:hAnsi="Fira Code Retina" w:cs="Fira Code Retina"/>
+          <w:sz w:val="20"/>
+          <w:szCs w:val="20"/>
+        </w:rPr>
+        <w:t>sudo</w:t>
+      </w:r>
+      <w:proofErr w:type="spellEnd"/>
+      <w:r>
+        <w:rPr>
+          <w:rFonts w:ascii="Fira Code Retina" w:hAnsi="Fira Code Retina" w:cs="Fira Code Retina"/>
+          <w:sz w:val="20"/>
+          <w:szCs w:val="20"/>
+        </w:rPr>
+        <w:t xml:space="preserve"> </w:t>
+      </w:r>
+      <w:proofErr w:type="spellStart"/>
+      <w:r>
+        <w:rPr>
+          <w:rFonts w:ascii="Fira Code Retina" w:hAnsi="Fira Code Retina" w:cs="Fira Code Retina"/>
+          <w:sz w:val="20"/>
+          <w:szCs w:val="20"/>
+        </w:rPr>
+        <w:t>systemctl</w:t>
+      </w:r>
+      <w:proofErr w:type="spellEnd"/>
+      <w:r>
+        <w:rPr>
+          <w:rFonts w:ascii="Fira Code Retina" w:hAnsi="Fira Code Retina" w:cs="Fira Code Retina"/>
+          <w:sz w:val="20"/>
+          <w:szCs w:val="20"/>
+        </w:rPr>
+        <w:t xml:space="preserve"> enable </w:t>
+      </w:r>
+      <w:proofErr w:type="spellStart"/>
+      <w:r>
+        <w:rPr>
+          <w:rFonts w:ascii="Fira Code Retina" w:hAnsi="Fira Code Retina" w:cs="Fira Code Retina"/>
+          <w:sz w:val="20"/>
+          <w:szCs w:val="20"/>
+        </w:rPr>
+        <w:t>netplan-</w:t>
+      </w:r>
+      <w:proofErr w:type="gramStart"/>
+      <w:r>
+        <w:rPr>
+          <w:rFonts w:ascii="Fira Code Retina" w:hAnsi="Fira Code Retina" w:cs="Fira Code Retina"/>
+          <w:sz w:val="20"/>
+          <w:szCs w:val="20"/>
+        </w:rPr>
+        <w:t>apply.service</w:t>
+      </w:r>
+      <w:proofErr w:type="spellEnd"/>
+      <w:proofErr w:type="gramEnd"/>
+    </w:p>
+    <w:p>
+      <w:pPr>
+        <w:spacing w:after="0"/>
+        <w:rPr>
+          <w:rFonts w:ascii="Fira Code Retina" w:hAnsi="Fira Code Retina" w:cs="Fira Code Retina"/>
+          <w:sz w:val="20"/>
+          <w:szCs w:val="20"/>
+        </w:rPr>
+      </w:pPr>
+      <w:proofErr w:type="spellStart"/>
+      <w:r>
+        <w:rPr>
+          <w:rFonts w:ascii="Fira Code Retina" w:hAnsi="Fira Code Retina" w:cs="Fira Code Retina"/>
+          <w:sz w:val="20"/>
+          <w:szCs w:val="20"/>
+        </w:rPr>
+        <w:t>sudo</w:t>
+      </w:r>
+      <w:proofErr w:type="spellEnd"/>
+      <w:r>
+        <w:rPr>
+          <w:rFonts w:ascii="Fira Code Retina" w:hAnsi="Fira Code Retina" w:cs="Fira Code Retina"/>
+          <w:sz w:val="20"/>
+          <w:szCs w:val="20"/>
+        </w:rPr>
+        <w:t xml:space="preserve"> </w:t>
+      </w:r>
+      <w:proofErr w:type="spellStart"/>
+      <w:r>
+        <w:rPr>
+          <w:rFonts w:ascii="Fira Code Retina" w:hAnsi="Fira Code Retina" w:cs="Fira Code Retina"/>
+          <w:sz w:val="20"/>
+          <w:szCs w:val="20"/>
+        </w:rPr>
+        <w:t>systemctl</w:t>
+      </w:r>
+      <w:proofErr w:type="spellEnd"/>
+      <w:r>
+        <w:rPr>
+          <w:rFonts w:ascii="Fira Code Retina" w:hAnsi="Fira Code Retina" w:cs="Fira Code Retina"/>
+          <w:sz w:val="20"/>
+          <w:szCs w:val="20"/>
+        </w:rPr>
+        <w:t xml:space="preserve"> start </w:t>
+      </w:r>
+      <w:proofErr w:type="spellStart"/>
+      <w:r>
+        <w:rPr>
+          <w:rFonts w:ascii="Fira Code Retina" w:hAnsi="Fira Code Retina" w:cs="Fira Code Retina"/>
+          <w:sz w:val="20"/>
+          <w:szCs w:val="20"/>
+        </w:rPr>
+        <w:t>netplan-</w:t>
+      </w:r>
+      <w:proofErr w:type="gramStart"/>
+      <w:r>
+        <w:rPr>
+          <w:rFonts w:ascii="Fira Code Retina" w:hAnsi="Fira Code Retina" w:cs="Fira Code Retina"/>
+          <w:sz w:val="20"/>
+          <w:szCs w:val="20"/>
+        </w:rPr>
+        <w:t>apply.service</w:t>
+      </w:r>
+      <w:proofErr w:type="spellEnd"/>
+      <w:proofErr w:type="gramEnd"/>
     </w:p>
     <w:p>
       <w:pPr>
@@ -3881,6 +5243,7 @@
       <w:r>
         <w:t xml:space="preserve">Configure </w:t>
       </w:r>
+      <w:proofErr w:type="spellStart"/>
       <w:r>
         <w:rPr>
           <w:rFonts w:ascii="Fira Code Retina" w:hAnsi="Fira Code Retina" w:cs="Fira Code Retina"/>
@@ -3889,6 +5252,7 @@
         </w:rPr>
         <w:t>chrony</w:t>
       </w:r>
+      <w:proofErr w:type="spellEnd"/>
       <w:r>
         <w:t>:</w:t>
       </w:r>
@@ -3902,14 +5266,34 @@
           <w:szCs w:val="20"/>
         </w:rPr>
       </w:pPr>
-      <w:r>
-        <w:rPr>
-          <w:rFonts w:ascii="Fira Code Retina" w:hAnsi="Fira Code Retina" w:cs="Fira Code Retina"/>
-          <w:sz w:val="20"/>
-          <w:szCs w:val="20"/>
-        </w:rPr>
-        <w:t>sudo nano /etc/chrony.conf</w:t>
-      </w:r>
+      <w:proofErr w:type="spellStart"/>
+      <w:r>
+        <w:rPr>
+          <w:rFonts w:ascii="Fira Code Retina" w:hAnsi="Fira Code Retina" w:cs="Fira Code Retina"/>
+          <w:sz w:val="20"/>
+          <w:szCs w:val="20"/>
+        </w:rPr>
+        <w:t>sudo</w:t>
+      </w:r>
+      <w:proofErr w:type="spellEnd"/>
+      <w:r>
+        <w:rPr>
+          <w:rFonts w:ascii="Fira Code Retina" w:hAnsi="Fira Code Retina" w:cs="Fira Code Retina"/>
+          <w:sz w:val="20"/>
+          <w:szCs w:val="20"/>
+        </w:rPr>
+        <w:t xml:space="preserve"> nano /etc/</w:t>
+      </w:r>
+      <w:proofErr w:type="spellStart"/>
+      <w:r>
+        <w:rPr>
+          <w:rFonts w:ascii="Fira Code Retina" w:hAnsi="Fira Code Retina" w:cs="Fira Code Retina"/>
+          <w:sz w:val="20"/>
+          <w:szCs w:val="20"/>
+        </w:rPr>
+        <w:t>chrony.conf</w:t>
+      </w:r>
+      <w:proofErr w:type="spellEnd"/>
     </w:p>
     <w:p>
       <w:pPr>
@@ -3930,8 +5314,18 @@
           <w:sz w:val="20"/>
           <w:szCs w:val="20"/>
         </w:rPr>
-        <w:t>#pool 2.fedora.pool.ntp.org iburst</w:t>
-      </w:r>
+        <w:t xml:space="preserve">#pool 2.fedora.pool.ntp.org </w:t>
+      </w:r>
+      <w:proofErr w:type="spellStart"/>
+      <w:r>
+        <w:rPr>
+          <w:rFonts w:ascii="Fira Code Retina" w:hAnsi="Fira Code Retina" w:cs="Fira Code Retina"/>
+          <w:sz w:val="20"/>
+          <w:szCs w:val="20"/>
+        </w:rPr>
+        <w:t>iburst</w:t>
+      </w:r>
+      <w:proofErr w:type="spellEnd"/>
     </w:p>
     <w:p>
       <w:pPr>
@@ -4047,8 +5441,18 @@
           <w:sz w:val="20"/>
           <w:szCs w:val="20"/>
         </w:rPr>
-        <w:t>server 192.168.10.1 iburst</w:t>
-      </w:r>
+        <w:t xml:space="preserve">server 192.168.10.1 </w:t>
+      </w:r>
+      <w:proofErr w:type="spellStart"/>
+      <w:r>
+        <w:rPr>
+          <w:rFonts w:ascii="Fira Code Retina" w:hAnsi="Fira Code Retina" w:cs="Fira Code Retina"/>
+          <w:sz w:val="20"/>
+          <w:szCs w:val="20"/>
+        </w:rPr>
+        <w:t>iburst</w:t>
+      </w:r>
+      <w:proofErr w:type="spellEnd"/>
     </w:p>
     <w:p>
       <w:pPr>
@@ -4073,6 +5477,7 @@
       <w:r>
         <w:t xml:space="preserve">Check </w:t>
       </w:r>
+      <w:proofErr w:type="spellStart"/>
       <w:r>
         <w:rPr>
           <w:rFonts w:ascii="Fira Code Retina" w:hAnsi="Fira Code Retina" w:cs="Fira Code Retina"/>
@@ -4081,6 +5486,7 @@
         </w:rPr>
         <w:t>chrony</w:t>
       </w:r>
+      <w:proofErr w:type="spellEnd"/>
       <w:r>
         <w:t xml:space="preserve"> is configured: </w:t>
       </w:r>
@@ -4094,32 +5500,62 @@
           <w:szCs w:val="20"/>
         </w:rPr>
       </w:pPr>
-      <w:r>
-        <w:rPr>
-          <w:rFonts w:ascii="Fira Code Retina" w:hAnsi="Fira Code Retina" w:cs="Fira Code Retina"/>
-          <w:sz w:val="20"/>
-          <w:szCs w:val="20"/>
-        </w:rPr>
-        <w:t>chronyc tracking</w:t>
-      </w:r>
-    </w:p>
-    <w:p>
-      <w:pPr>
-        <w:spacing w:after="0"/>
-        <w:rPr>
-          <w:rFonts w:ascii="Fira Code Retina" w:hAnsi="Fira Code Retina" w:cs="Fira Code Retina"/>
-          <w:sz w:val="20"/>
-          <w:szCs w:val="20"/>
-        </w:rPr>
-      </w:pPr>
-      <w:r>
-        <w:rPr>
-          <w:rFonts w:ascii="Fira Code Retina" w:hAnsi="Fira Code Retina" w:cs="Fira Code Retina"/>
-          <w:sz w:val="20"/>
-          <w:szCs w:val="20"/>
-        </w:rPr>
-        <w:t>chronyc sources -av</w:t>
-      </w:r>
+      <w:proofErr w:type="spellStart"/>
+      <w:r>
+        <w:rPr>
+          <w:rFonts w:ascii="Fira Code Retina" w:hAnsi="Fira Code Retina" w:cs="Fira Code Retina"/>
+          <w:sz w:val="20"/>
+          <w:szCs w:val="20"/>
+        </w:rPr>
+        <w:t>chronyc</w:t>
+      </w:r>
+      <w:proofErr w:type="spellEnd"/>
+      <w:r>
+        <w:rPr>
+          <w:rFonts w:ascii="Fira Code Retina" w:hAnsi="Fira Code Retina" w:cs="Fira Code Retina"/>
+          <w:sz w:val="20"/>
+          <w:szCs w:val="20"/>
+        </w:rPr>
+        <w:t xml:space="preserve"> tracking</w:t>
+      </w:r>
+    </w:p>
+    <w:p>
+      <w:pPr>
+        <w:spacing w:after="0"/>
+        <w:rPr>
+          <w:rFonts w:ascii="Fira Code Retina" w:hAnsi="Fira Code Retina" w:cs="Fira Code Retina"/>
+          <w:sz w:val="20"/>
+          <w:szCs w:val="20"/>
+        </w:rPr>
+      </w:pPr>
+      <w:proofErr w:type="spellStart"/>
+      <w:r>
+        <w:rPr>
+          <w:rFonts w:ascii="Fira Code Retina" w:hAnsi="Fira Code Retina" w:cs="Fira Code Retina"/>
+          <w:sz w:val="20"/>
+          <w:szCs w:val="20"/>
+        </w:rPr>
+        <w:t>chronyc</w:t>
+      </w:r>
+      <w:proofErr w:type="spellEnd"/>
+      <w:r>
+        <w:rPr>
+          <w:rFonts w:ascii="Fira Code Retina" w:hAnsi="Fira Code Retina" w:cs="Fira Code Retina"/>
+          <w:sz w:val="20"/>
+          <w:szCs w:val="20"/>
+        </w:rPr>
+        <w:t xml:space="preserve"> sources -</w:t>
+      </w:r>
+      <w:proofErr w:type="spellStart"/>
+      <w:r>
+        <w:rPr>
+          <w:rFonts w:ascii="Fira Code Retina" w:hAnsi="Fira Code Retina" w:cs="Fira Code Retina"/>
+          <w:sz w:val="20"/>
+          <w:szCs w:val="20"/>
+        </w:rPr>
+        <w:t>av</w:t>
+      </w:r>
+      <w:proofErr w:type="spellEnd"/>
     </w:p>
     <w:p>
       <w:pPr>
@@ -4280,6 +5716,7 @@
         <w:lastRenderedPageBreak/>
         <w:t xml:space="preserve">The default meter is </w:t>
       </w:r>
+      <w:proofErr w:type="spellStart"/>
       <w:r>
         <w:rPr>
           <w:rFonts w:ascii="Fira Code Retina" w:hAnsi="Fira Code Retina" w:cs="Fira Code Retina"/>
@@ -4288,14 +5725,25 @@
         </w:rPr>
         <w:t>owdm</w:t>
       </w:r>
+      <w:proofErr w:type="spellEnd"/>
       <w:r>
         <w:t xml:space="preserve"> (one-way delay meter), which only produces correct data if all PCs have clocks in sync (e.g. via </w:t>
       </w:r>
+      <w:proofErr w:type="spellStart"/>
       <w:r>
         <w:t>timesyncd</w:t>
       </w:r>
-      <w:r>
-        <w:t xml:space="preserve"> or chrony).</w:t>
+      <w:proofErr w:type="spellEnd"/>
+      <w:r>
+        <w:t xml:space="preserve"> or </w:t>
+      </w:r>
+      <w:proofErr w:type="spellStart"/>
+      <w:r>
+        <w:t>chrony</w:t>
+      </w:r>
+      <w:proofErr w:type="spellEnd"/>
+      <w:r>
+        <w:t>).</w:t>
       </w:r>
     </w:p>
     <w:p>
@@ -4314,6 +5762,7 @@
           <w:szCs w:val="20"/>
         </w:rPr>
       </w:pPr>
+      <w:proofErr w:type="spellStart"/>
       <w:r>
         <w:rPr>
           <w:rFonts w:ascii="Fira Code Retina" w:hAnsi="Fira Code Retina" w:cs="Fira Code Retina"/>
@@ -4322,6 +5771,7 @@
         </w:rPr>
         <w:t>ITGRecv</w:t>
       </w:r>
+      <w:proofErr w:type="spellEnd"/>
     </w:p>
     <w:p>
       <w:pPr>
@@ -4347,13 +5797,59 @@
           <w:szCs w:val="20"/>
         </w:rPr>
       </w:pPr>
-      <w:r>
-        <w:rPr>
-          <w:rFonts w:ascii="Fira Code Retina" w:hAnsi="Fira Code Retina" w:cs="Fira Code Retina"/>
-          <w:sz w:val="20"/>
-          <w:szCs w:val="20"/>
-        </w:rPr>
-        <w:t>ITGSend -a 192.168.30.2 -T &lt;protocol&gt; -c &lt;pkt_size&gt; -t 30000 -m rttm -l send.log -x recv.log</w:t>
+      <w:proofErr w:type="spellStart"/>
+      <w:r>
+        <w:rPr>
+          <w:rFonts w:ascii="Fira Code Retina" w:hAnsi="Fira Code Retina" w:cs="Fira Code Retina"/>
+          <w:sz w:val="20"/>
+          <w:szCs w:val="20"/>
+        </w:rPr>
+        <w:t>ITGSend</w:t>
+      </w:r>
+      <w:proofErr w:type="spellEnd"/>
+      <w:r>
+        <w:rPr>
+          <w:rFonts w:ascii="Fira Code Retina" w:hAnsi="Fira Code Retina" w:cs="Fira Code Retina"/>
+          <w:sz w:val="20"/>
+          <w:szCs w:val="20"/>
+        </w:rPr>
+        <w:t xml:space="preserve"> -a 192.168.30.2 -T &lt;protocol&gt; -c &lt;</w:t>
+      </w:r>
+      <w:proofErr w:type="spellStart"/>
+      <w:r>
+        <w:rPr>
+          <w:rFonts w:ascii="Fira Code Retina" w:hAnsi="Fira Code Retina" w:cs="Fira Code Retina"/>
+          <w:sz w:val="20"/>
+          <w:szCs w:val="20"/>
+        </w:rPr>
+        <w:t>pkt_size</w:t>
+      </w:r>
+      <w:proofErr w:type="spellEnd"/>
+      <w:r>
+        <w:rPr>
+          <w:rFonts w:ascii="Fira Code Retina" w:hAnsi="Fira Code Retina" w:cs="Fira Code Retina"/>
+          <w:sz w:val="20"/>
+          <w:szCs w:val="20"/>
+        </w:rPr>
+        <w:t xml:space="preserve">&gt; -t 30000 -m </w:t>
+      </w:r>
+      <w:proofErr w:type="spellStart"/>
+      <w:r>
+        <w:rPr>
+          <w:rFonts w:ascii="Fira Code Retina" w:hAnsi="Fira Code Retina" w:cs="Fira Code Retina"/>
+          <w:sz w:val="20"/>
+          <w:szCs w:val="20"/>
+        </w:rPr>
+        <w:t>rttm</w:t>
+      </w:r>
+      <w:proofErr w:type="spellEnd"/>
+      <w:r>
+        <w:rPr>
+          <w:rFonts w:ascii="Fira Code Retina" w:hAnsi="Fira Code Retina" w:cs="Fira Code Retina"/>
+          <w:sz w:val="20"/>
+          <w:szCs w:val="20"/>
+        </w:rPr>
+        <w:t xml:space="preserve"> -l send.log -x recv.log</w:t>
       </w:r>
     </w:p>
     <w:p>
@@ -4372,13 +5868,59 @@
           <w:szCs w:val="20"/>
         </w:rPr>
       </w:pPr>
-      <w:r>
-        <w:rPr>
-          <w:rFonts w:ascii="Fira Code Retina" w:hAnsi="Fira Code Retina" w:cs="Fira Code Retina"/>
-          <w:sz w:val="20"/>
-          <w:szCs w:val="20"/>
-        </w:rPr>
-        <w:t>ITGSend -a fd00:0:0:30::2 -T &lt;protocol&gt; -c &lt;pkt_size&gt; -t 30000 -m rttm -l send.log -x recv.log</w:t>
+      <w:proofErr w:type="spellStart"/>
+      <w:r>
+        <w:rPr>
+          <w:rFonts w:ascii="Fira Code Retina" w:hAnsi="Fira Code Retina" w:cs="Fira Code Retina"/>
+          <w:sz w:val="20"/>
+          <w:szCs w:val="20"/>
+        </w:rPr>
+        <w:t>ITGSend</w:t>
+      </w:r>
+      <w:proofErr w:type="spellEnd"/>
+      <w:r>
+        <w:rPr>
+          <w:rFonts w:ascii="Fira Code Retina" w:hAnsi="Fira Code Retina" w:cs="Fira Code Retina"/>
+          <w:sz w:val="20"/>
+          <w:szCs w:val="20"/>
+        </w:rPr>
+        <w:t xml:space="preserve"> -a fd00:0:0:30::2 -T &lt;protocol&gt; -c &lt;</w:t>
+      </w:r>
+      <w:proofErr w:type="spellStart"/>
+      <w:r>
+        <w:rPr>
+          <w:rFonts w:ascii="Fira Code Retina" w:hAnsi="Fira Code Retina" w:cs="Fira Code Retina"/>
+          <w:sz w:val="20"/>
+          <w:szCs w:val="20"/>
+        </w:rPr>
+        <w:t>pkt_size</w:t>
+      </w:r>
+      <w:proofErr w:type="spellEnd"/>
+      <w:r>
+        <w:rPr>
+          <w:rFonts w:ascii="Fira Code Retina" w:hAnsi="Fira Code Retina" w:cs="Fira Code Retina"/>
+          <w:sz w:val="20"/>
+          <w:szCs w:val="20"/>
+        </w:rPr>
+        <w:t xml:space="preserve">&gt; -t 30000 -m </w:t>
+      </w:r>
+      <w:proofErr w:type="spellStart"/>
+      <w:r>
+        <w:rPr>
+          <w:rFonts w:ascii="Fira Code Retina" w:hAnsi="Fira Code Retina" w:cs="Fira Code Retina"/>
+          <w:sz w:val="20"/>
+          <w:szCs w:val="20"/>
+        </w:rPr>
+        <w:t>rttm</w:t>
+      </w:r>
+      <w:proofErr w:type="spellEnd"/>
+      <w:r>
+        <w:rPr>
+          <w:rFonts w:ascii="Fira Code Retina" w:hAnsi="Fira Code Retina" w:cs="Fira Code Retina"/>
+          <w:sz w:val="20"/>
+          <w:szCs w:val="20"/>
+        </w:rPr>
+        <w:t xml:space="preserve"> -l send.log -x recv.log</w:t>
       </w:r>
     </w:p>
     <w:p>
@@ -4394,7 +5936,15 @@
         <w:spacing w:after="0"/>
       </w:pPr>
       <w:r>
-        <w:t>Logs can be decrypted with ITGDec:</w:t>
+        <w:t xml:space="preserve">Logs can be decrypted with </w:t>
+      </w:r>
+      <w:proofErr w:type="spellStart"/>
+      <w:r>
+        <w:t>ITGDec</w:t>
+      </w:r>
+      <w:proofErr w:type="spellEnd"/>
+      <w:r>
+        <w:t>:</w:t>
       </w:r>
     </w:p>
     <w:p>
@@ -4417,13 +5967,23 @@
       <w:r>
         <w:tab/>
       </w:r>
-      <w:r>
-        <w:rPr>
-          <w:rFonts w:ascii="Fira Code Retina" w:hAnsi="Fira Code Retina" w:cs="Fira Code Retina"/>
-          <w:sz w:val="20"/>
-          <w:szCs w:val="20"/>
-        </w:rPr>
-        <w:t>ITGDec &lt;name&gt;.log -l &lt;name&gt;.txt</w:t>
+      <w:proofErr w:type="spellStart"/>
+      <w:r>
+        <w:rPr>
+          <w:rFonts w:ascii="Fira Code Retina" w:hAnsi="Fira Code Retina" w:cs="Fira Code Retina"/>
+          <w:sz w:val="20"/>
+          <w:szCs w:val="20"/>
+        </w:rPr>
+        <w:t>ITGDec</w:t>
+      </w:r>
+      <w:proofErr w:type="spellEnd"/>
+      <w:r>
+        <w:rPr>
+          <w:rFonts w:ascii="Fira Code Retina" w:hAnsi="Fira Code Retina" w:cs="Fira Code Retina"/>
+          <w:sz w:val="20"/>
+          <w:szCs w:val="20"/>
+        </w:rPr>
+        <w:t xml:space="preserve"> &lt;name&gt;.log -l &lt;name&gt;.txt</w:t>
       </w:r>
     </w:p>
     <w:p>
@@ -4432,7 +5992,15 @@
       </w:pPr>
       <w:r>
         <w:tab/>
-        <w:t>To DATs (for use with Octave or MatPlot):</w:t>
+        <w:t xml:space="preserve">To DATs (for use with Octave or </w:t>
+      </w:r>
+      <w:proofErr w:type="spellStart"/>
+      <w:r>
+        <w:t>MatPlot</w:t>
+      </w:r>
+      <w:proofErr w:type="spellEnd"/>
+      <w:r>
+        <w:t>):</w:t>
       </w:r>
     </w:p>
     <w:p>
@@ -4455,14 +6023,34 @@
       <w:r>
         <w:tab/>
       </w:r>
-      <w:r>
-        <w:rPr>
-          <w:rFonts w:ascii="Fira Code Retina" w:hAnsi="Fira Code Retina" w:cs="Fira Code Retina"/>
-          <w:sz w:val="20"/>
-          <w:szCs w:val="20"/>
-        </w:rPr>
-        <w:t>ITGDec &lt;name&gt;.log -o &lt;name&gt;.dat</w:t>
-      </w:r>
+      <w:proofErr w:type="spellStart"/>
+      <w:r>
+        <w:rPr>
+          <w:rFonts w:ascii="Fira Code Retina" w:hAnsi="Fira Code Retina" w:cs="Fira Code Retina"/>
+          <w:sz w:val="20"/>
+          <w:szCs w:val="20"/>
+        </w:rPr>
+        <w:t>ITGDec</w:t>
+      </w:r>
+      <w:proofErr w:type="spellEnd"/>
+      <w:r>
+        <w:rPr>
+          <w:rFonts w:ascii="Fira Code Retina" w:hAnsi="Fira Code Retina" w:cs="Fira Code Retina"/>
+          <w:sz w:val="20"/>
+          <w:szCs w:val="20"/>
+        </w:rPr>
+        <w:t xml:space="preserve"> &lt;name&gt;.log -o &lt;name&gt;.</w:t>
+      </w:r>
+      <w:proofErr w:type="spellStart"/>
+      <w:r>
+        <w:rPr>
+          <w:rFonts w:ascii="Fira Code Retina" w:hAnsi="Fira Code Retina" w:cs="Fira Code Retina"/>
+          <w:sz w:val="20"/>
+          <w:szCs w:val="20"/>
+        </w:rPr>
+        <w:t>dat</w:t>
+      </w:r>
+      <w:proofErr w:type="spellEnd"/>
     </w:p>
     <w:p>
       <w:pPr>
@@ -4484,13 +6072,23 @@
       <w:r>
         <w:tab/>
       </w:r>
-      <w:r>
-        <w:rPr>
-          <w:rFonts w:ascii="Fira Code Retina" w:hAnsi="Fira Code Retina" w:cs="Fira Code Retina"/>
-          <w:sz w:val="20"/>
-          <w:szCs w:val="20"/>
-        </w:rPr>
-        <w:t>ITGDec &lt;name&gt;.log -d 100 &lt;name&gt;_delay.dat</w:t>
+      <w:proofErr w:type="spellStart"/>
+      <w:r>
+        <w:rPr>
+          <w:rFonts w:ascii="Fira Code Retina" w:hAnsi="Fira Code Retina" w:cs="Fira Code Retina"/>
+          <w:sz w:val="20"/>
+          <w:szCs w:val="20"/>
+        </w:rPr>
+        <w:t>ITGDec</w:t>
+      </w:r>
+      <w:proofErr w:type="spellEnd"/>
+      <w:r>
+        <w:rPr>
+          <w:rFonts w:ascii="Fira Code Retina" w:hAnsi="Fira Code Retina" w:cs="Fira Code Retina"/>
+          <w:sz w:val="20"/>
+          <w:szCs w:val="20"/>
+        </w:rPr>
+        <w:t xml:space="preserve"> &lt;name&gt;.log -d 100 &lt;name&gt;_delay.dat</w:t>
       </w:r>
     </w:p>
     <w:p>
@@ -4513,13 +6111,23 @@
       <w:r>
         <w:tab/>
       </w:r>
-      <w:r>
-        <w:rPr>
-          <w:rFonts w:ascii="Fira Code Retina" w:hAnsi="Fira Code Retina" w:cs="Fira Code Retina"/>
-          <w:sz w:val="20"/>
-          <w:szCs w:val="20"/>
-        </w:rPr>
-        <w:t>ITGDec &lt;name&gt;.log -j 100 &lt;name&gt;_jitter.dat</w:t>
+      <w:proofErr w:type="spellStart"/>
+      <w:r>
+        <w:rPr>
+          <w:rFonts w:ascii="Fira Code Retina" w:hAnsi="Fira Code Retina" w:cs="Fira Code Retina"/>
+          <w:sz w:val="20"/>
+          <w:szCs w:val="20"/>
+        </w:rPr>
+        <w:t>ITGDec</w:t>
+      </w:r>
+      <w:proofErr w:type="spellEnd"/>
+      <w:r>
+        <w:rPr>
+          <w:rFonts w:ascii="Fira Code Retina" w:hAnsi="Fira Code Retina" w:cs="Fira Code Retina"/>
+          <w:sz w:val="20"/>
+          <w:szCs w:val="20"/>
+        </w:rPr>
+        <w:t xml:space="preserve"> &lt;name&gt;.log -j 100 &lt;name&gt;_jitter.dat</w:t>
       </w:r>
     </w:p>
     <w:p>
@@ -4542,13 +6150,23 @@
       <w:r>
         <w:tab/>
       </w:r>
-      <w:r>
-        <w:rPr>
-          <w:rFonts w:ascii="Fira Code Retina" w:hAnsi="Fira Code Retina" w:cs="Fira Code Retina"/>
-          <w:sz w:val="20"/>
-          <w:szCs w:val="20"/>
-        </w:rPr>
-        <w:t>ITGDec &lt;name&gt;.log -p 100 &lt;name&gt;_packetloss.dat</w:t>
+      <w:proofErr w:type="spellStart"/>
+      <w:r>
+        <w:rPr>
+          <w:rFonts w:ascii="Fira Code Retina" w:hAnsi="Fira Code Retina" w:cs="Fira Code Retina"/>
+          <w:sz w:val="20"/>
+          <w:szCs w:val="20"/>
+        </w:rPr>
+        <w:t>ITGDec</w:t>
+      </w:r>
+      <w:proofErr w:type="spellEnd"/>
+      <w:r>
+        <w:rPr>
+          <w:rFonts w:ascii="Fira Code Retina" w:hAnsi="Fira Code Retina" w:cs="Fira Code Retina"/>
+          <w:sz w:val="20"/>
+          <w:szCs w:val="20"/>
+        </w:rPr>
+        <w:t xml:space="preserve"> &lt;name&gt;.log -p 100 &lt;name&gt;_packetloss.dat</w:t>
       </w:r>
     </w:p>
     <w:p>
@@ -4571,13 +6189,23 @@
       <w:r>
         <w:tab/>
       </w:r>
-      <w:r>
-        <w:rPr>
-          <w:rFonts w:ascii="Fira Code Retina" w:hAnsi="Fira Code Retina" w:cs="Fira Code Retina"/>
-          <w:sz w:val="20"/>
-          <w:szCs w:val="20"/>
-        </w:rPr>
-        <w:t>ITGDec &lt;name&gt;.log -b 100 &lt;name&gt;_throughput.dat</w:t>
+      <w:proofErr w:type="spellStart"/>
+      <w:r>
+        <w:rPr>
+          <w:rFonts w:ascii="Fira Code Retina" w:hAnsi="Fira Code Retina" w:cs="Fira Code Retina"/>
+          <w:sz w:val="20"/>
+          <w:szCs w:val="20"/>
+        </w:rPr>
+        <w:t>ITGDec</w:t>
+      </w:r>
+      <w:proofErr w:type="spellEnd"/>
+      <w:r>
+        <w:rPr>
+          <w:rFonts w:ascii="Fira Code Retina" w:hAnsi="Fira Code Retina" w:cs="Fira Code Retina"/>
+          <w:sz w:val="20"/>
+          <w:szCs w:val="20"/>
+        </w:rPr>
+        <w:t xml:space="preserve"> &lt;name&gt;.log -b 100 &lt;name&gt;_throughput.dat</w:t>
       </w:r>
     </w:p>
     <w:sectPr>
@@ -5242,6 +6870,7 @@
   <w:style w:type="character" w:default="1" w:styleId="DefaultParagraphFont">
     <w:name w:val="Default Paragraph Font"/>
     <w:uiPriority w:val="1"/>
+    <w:semiHidden/>
     <w:unhideWhenUsed/>
   </w:style>
   <w:style w:type="table" w:default="1" w:styleId="TableNormal">

</xml_diff>